<commit_message>
Fix - Update docs, correct macros, fix tree
</commit_message>
<xml_diff>
--- a/res/Modem.docx
+++ b/res/Modem.docx
@@ -676,8 +676,18 @@
           <w:sz w:val="18"/>
           <w:szCs w:val="18"/>
         </w:rPr>
-        <w:t xml:space="preserve">[ ATARI COMPUTER ]                </w:t>
-      </w:r>
+        <w:t>[ ATARI COMPUTER ]                |                  [ PC RUNNING ASPEQT ]</w:t>
+      </w:r>
+    </w:p>
+    <w:p>
+      <w:pPr>
+        <w:pStyle w:val="PreformattedText"/>
+        <w:bidi w:val="0"/>
+        <w:spacing w:lineRule="auto" w:line="274" w:before="0" w:after="0"/>
+        <w:ind w:hanging="0" w:start="0" w:end="0"/>
+        <w:jc w:val="start"/>
+        <w:rPr/>
+      </w:pPr>
       <w:r>
         <w:rPr>
           <w:rStyle w:val="SourceText"/>
@@ -685,16 +695,29 @@
           <w:sz w:val="18"/>
           <w:szCs w:val="18"/>
         </w:rPr>
-        <w:t>|</w:t>
-      </w:r>
-      <w:r>
+        <w:t>------------------------------------------------------------------------------------------</w:t>
+      </w:r>
+    </w:p>
+    <w:p>
+      <w:pPr>
+        <w:pStyle w:val="PreformattedText"/>
+        <w:bidi w:val="0"/>
+        <w:spacing w:lineRule="auto" w:line="274" w:before="0" w:after="0"/>
+        <w:ind w:hanging="0" w:start="0" w:end="0"/>
+        <w:jc w:val="start"/>
         <w:rPr>
           <w:rStyle w:val="SourceText"/>
           <w:rFonts w:ascii="Hack" w:hAnsi="Hack"/>
           <w:sz w:val="18"/>
           <w:szCs w:val="18"/>
         </w:rPr>
-        <w:t xml:space="preserve">                  [ PC RUNNING ASPEQT ]</w:t>
+      </w:pPr>
+      <w:r>
+        <w:rPr>
+          <w:rFonts w:ascii="Hack" w:hAnsi="Hack"/>
+          <w:sz w:val="18"/>
+          <w:szCs w:val="18"/>
+        </w:rPr>
       </w:r>
     </w:p>
     <w:p>
@@ -702,7 +725,6 @@
         <w:pStyle w:val="PreformattedText"/>
         <w:bidi w:val="0"/>
         <w:spacing w:lineRule="auto" w:line="274" w:before="0" w:after="0"/>
-        <w:ind w:hanging="0" w:start="0" w:end="0"/>
         <w:jc w:val="start"/>
         <w:rPr/>
       </w:pPr>
@@ -713,25 +735,16 @@
           <w:sz w:val="18"/>
           <w:szCs w:val="18"/>
         </w:rPr>
-        <w:t>------------------------------------------------------------------------------------------</w:t>
-      </w:r>
-    </w:p>
-    <w:p>
-      <w:pPr>
-        <w:pStyle w:val="PreformattedText"/>
-        <w:bidi w:val="0"/>
-        <w:spacing w:lineRule="auto" w:line="274" w:before="0" w:after="0"/>
-        <w:ind w:hanging="0" w:start="0" w:end="0"/>
-        <w:jc w:val="start"/>
+        <w:t xml:space="preserve">      </w:t>
+      </w:r>
+      <w:r>
         <w:rPr>
           <w:rStyle w:val="SourceText"/>
           <w:rFonts w:ascii="Hack" w:hAnsi="Hack"/>
           <w:sz w:val="18"/>
           <w:szCs w:val="18"/>
         </w:rPr>
-      </w:pPr>
-      <w:r>
-        <w:rPr/>
+        <w:t>+------------------+                                 +---------------------+</w:t>
       </w:r>
     </w:p>
     <w:p>
@@ -758,7 +771,7 @@
           <w:sz w:val="18"/>
           <w:szCs w:val="18"/>
         </w:rPr>
-        <w:t>+------------------+                                 +---------------------+</w:t>
+        <w:t>|                  |            (1)                  |                     |</w:t>
       </w:r>
     </w:p>
     <w:p>
@@ -785,7 +798,7 @@
           <w:sz w:val="18"/>
           <w:szCs w:val="18"/>
         </w:rPr>
-        <w:t>|                  |            (1)                  |                     |</w:t>
+        <w:t>|     SIO PORT     |========[ SIO2PC ]==============&gt;|   [ USB PORT 1 ]    |</w:t>
       </w:r>
     </w:p>
     <w:p>
@@ -812,8 +825,17 @@
           <w:sz w:val="18"/>
           <w:szCs w:val="18"/>
         </w:rPr>
-        <w:t>|     SIO PORT     |===</w:t>
-      </w:r>
+        <w:t>|                  |   ( Daisy Chain SIO Cable )     |   (SIO / Disks)     |</w:t>
+      </w:r>
+    </w:p>
+    <w:p>
+      <w:pPr>
+        <w:pStyle w:val="PreformattedText"/>
+        <w:bidi w:val="0"/>
+        <w:spacing w:lineRule="auto" w:line="274" w:before="0" w:after="0"/>
+        <w:jc w:val="start"/>
+        <w:rPr/>
+      </w:pPr>
       <w:r>
         <w:rPr>
           <w:rStyle w:val="SourceText"/>
@@ -821,7 +843,7 @@
           <w:sz w:val="18"/>
           <w:szCs w:val="18"/>
         </w:rPr>
-        <w:t>=</w:t>
+        <w:t xml:space="preserve">      </w:t>
       </w:r>
       <w:r>
         <w:rPr>
@@ -830,8 +852,17 @@
           <w:sz w:val="18"/>
           <w:szCs w:val="18"/>
         </w:rPr>
-        <w:t>====[ SIO2PC ]=======</w:t>
-      </w:r>
+        <w:t>+------------------+                                 +---------------------+</w:t>
+      </w:r>
+    </w:p>
+    <w:p>
+      <w:pPr>
+        <w:pStyle w:val="PreformattedText"/>
+        <w:bidi w:val="0"/>
+        <w:spacing w:lineRule="auto" w:line="274" w:before="0" w:after="0"/>
+        <w:jc w:val="start"/>
+        <w:rPr/>
+      </w:pPr>
       <w:r>
         <w:rPr>
           <w:rStyle w:val="SourceText"/>
@@ -839,7 +870,7 @@
           <w:sz w:val="18"/>
           <w:szCs w:val="18"/>
         </w:rPr>
-        <w:t>=</w:t>
+        <w:t xml:space="preserve">              </w:t>
       </w:r>
       <w:r>
         <w:rPr>
@@ -848,8 +879,17 @@
           <w:sz w:val="18"/>
           <w:szCs w:val="18"/>
         </w:rPr>
-        <w:t>====</w:t>
-      </w:r>
+        <w:t xml:space="preserve">|                                                      |  </w:t>
+      </w:r>
+    </w:p>
+    <w:p>
+      <w:pPr>
+        <w:pStyle w:val="PreformattedText"/>
+        <w:bidi w:val="0"/>
+        <w:spacing w:lineRule="auto" w:line="274" w:before="0" w:after="0"/>
+        <w:jc w:val="start"/>
+        <w:rPr/>
+      </w:pPr>
       <w:r>
         <w:rPr>
           <w:rStyle w:val="SourceText"/>
@@ -857,7 +897,7 @@
           <w:sz w:val="18"/>
           <w:szCs w:val="18"/>
         </w:rPr>
-        <w:t>=</w:t>
+        <w:t xml:space="preserve">              </w:t>
       </w:r>
       <w:r>
         <w:rPr>
@@ -866,7 +906,7 @@
           <w:sz w:val="18"/>
           <w:szCs w:val="18"/>
         </w:rPr>
-        <w:t>=&gt;|   [ USB PORT 1 ]    |</w:t>
+        <w:t>|                                                      v</w:t>
       </w:r>
     </w:p>
     <w:p>
@@ -884,7 +924,7 @@
           <w:sz w:val="18"/>
           <w:szCs w:val="18"/>
         </w:rPr>
-        <w:t xml:space="preserve">      </w:t>
+        <w:t xml:space="preserve">              </w:t>
       </w:r>
       <w:r>
         <w:rPr>
@@ -893,8 +933,17 @@
           <w:sz w:val="18"/>
           <w:szCs w:val="18"/>
         </w:rPr>
-        <w:t xml:space="preserve">|                  |   </w:t>
-      </w:r>
+        <w:t xml:space="preserve">| ( Daisy Chain SIO Cable )                   ( ATR, ATX, XEX, TNFS )  </w:t>
+      </w:r>
+    </w:p>
+    <w:p>
+      <w:pPr>
+        <w:pStyle w:val="PreformattedText"/>
+        <w:bidi w:val="0"/>
+        <w:spacing w:lineRule="auto" w:line="274" w:before="0" w:after="0"/>
+        <w:jc w:val="start"/>
+        <w:rPr/>
+      </w:pPr>
       <w:r>
         <w:rPr>
           <w:rStyle w:val="SourceText"/>
@@ -902,7 +951,7 @@
           <w:sz w:val="18"/>
           <w:szCs w:val="18"/>
         </w:rPr>
-        <w:t xml:space="preserve">( </w:t>
+        <w:t xml:space="preserve">              </w:t>
       </w:r>
       <w:r>
         <w:rPr>
@@ -911,7 +960,7 @@
           <w:sz w:val="18"/>
           <w:szCs w:val="18"/>
         </w:rPr>
-        <w:t>Daisy Chain SIO Cable )     |   (SIO / Disks)     |</w:t>
+        <w:t>|</w:t>
       </w:r>
     </w:p>
     <w:p>
@@ -929,7 +978,7 @@
           <w:sz w:val="18"/>
           <w:szCs w:val="18"/>
         </w:rPr>
-        <w:t xml:space="preserve">      </w:t>
+        <w:t xml:space="preserve">              </w:t>
       </w:r>
       <w:r>
         <w:rPr>
@@ -938,7 +987,7 @@
           <w:sz w:val="18"/>
           <w:szCs w:val="18"/>
         </w:rPr>
-        <w:t>+------------------+                                 +---------------------+</w:t>
+        <w:t>|</w:t>
       </w:r>
     </w:p>
     <w:p>
@@ -956,7 +1005,7 @@
           <w:sz w:val="18"/>
           <w:szCs w:val="18"/>
         </w:rPr>
-        <w:t xml:space="preserve">              </w:t>
+        <w:t xml:space="preserve">      </w:t>
       </w:r>
       <w:r>
         <w:rPr>
@@ -965,8 +1014,17 @@
           <w:sz w:val="18"/>
           <w:szCs w:val="18"/>
         </w:rPr>
-        <w:t xml:space="preserve">|                                                      </w:t>
-      </w:r>
+        <w:t>+------------------+                                 +---------------------+</w:t>
+      </w:r>
+    </w:p>
+    <w:p>
+      <w:pPr>
+        <w:pStyle w:val="PreformattedText"/>
+        <w:bidi w:val="0"/>
+        <w:spacing w:lineRule="auto" w:line="274" w:before="0" w:after="0"/>
+        <w:jc w:val="start"/>
+        <w:rPr/>
+      </w:pPr>
       <w:r>
         <w:rPr>
           <w:rStyle w:val="SourceText"/>
@@ -974,7 +1032,7 @@
           <w:sz w:val="18"/>
           <w:szCs w:val="18"/>
         </w:rPr>
-        <w:t>|</w:t>
+        <w:t xml:space="preserve">      </w:t>
       </w:r>
       <w:r>
         <w:rPr>
@@ -983,7 +1041,7 @@
           <w:sz w:val="18"/>
           <w:szCs w:val="18"/>
         </w:rPr>
-        <w:t xml:space="preserve">  </w:t>
+        <w:t>|   850 INTERFACE  |            (2)                  |                     |</w:t>
       </w:r>
     </w:p>
     <w:p>
@@ -1001,7 +1059,7 @@
           <w:sz w:val="18"/>
           <w:szCs w:val="18"/>
         </w:rPr>
-        <w:t xml:space="preserve">              </w:t>
+        <w:t xml:space="preserve">      </w:t>
       </w:r>
       <w:r>
         <w:rPr>
@@ -1010,7 +1068,7 @@
           <w:sz w:val="18"/>
           <w:szCs w:val="18"/>
         </w:rPr>
-        <w:t>|                                                      v</w:t>
+        <w:t>|    (R: DEVICE)   |======[ CUSTOM NULL ]===========&gt;|   [ USB PORT 2 ]    |</w:t>
       </w:r>
     </w:p>
     <w:p>
@@ -1028,7 +1086,7 @@
           <w:sz w:val="18"/>
           <w:szCs w:val="18"/>
         </w:rPr>
-        <w:t xml:space="preserve">              </w:t>
+        <w:t xml:space="preserve">      </w:t>
       </w:r>
       <w:r>
         <w:rPr>
@@ -1037,8 +1095,17 @@
           <w:sz w:val="18"/>
           <w:szCs w:val="18"/>
         </w:rPr>
-        <w:t xml:space="preserve">| ( Daisy Chain SIO Cable )                   </w:t>
-      </w:r>
+        <w:t>|      PORT 1      |        MODEM CABLE              |   (Modem Bridge)    |</w:t>
+      </w:r>
+    </w:p>
+    <w:p>
+      <w:pPr>
+        <w:pStyle w:val="PreformattedText"/>
+        <w:bidi w:val="0"/>
+        <w:spacing w:lineRule="auto" w:line="274" w:before="0" w:after="0"/>
+        <w:jc w:val="start"/>
+        <w:rPr/>
+      </w:pPr>
       <w:r>
         <w:rPr>
           <w:rStyle w:val="SourceText"/>
@@ -1046,7 +1113,7 @@
           <w:sz w:val="18"/>
           <w:szCs w:val="18"/>
         </w:rPr>
-        <w:t>( ATR, ATX, XEX, TNFS )</w:t>
+        <w:t xml:space="preserve">      </w:t>
       </w:r>
       <w:r>
         <w:rPr>
@@ -1055,7 +1122,7 @@
           <w:sz w:val="18"/>
           <w:szCs w:val="18"/>
         </w:rPr>
-        <w:t xml:space="preserve">  </w:t>
+        <w:t>+------------------+                                 +---------------------+</w:t>
       </w:r>
     </w:p>
     <w:p>
@@ -1073,7 +1140,7 @@
           <w:sz w:val="18"/>
           <w:szCs w:val="18"/>
         </w:rPr>
-        <w:t xml:space="preserve">              </w:t>
+        <w:t xml:space="preserve">                                                                     </w:t>
       </w:r>
       <w:r>
         <w:rPr>
@@ -1100,7 +1167,7 @@
           <w:sz w:val="18"/>
           <w:szCs w:val="18"/>
         </w:rPr>
-        <w:t xml:space="preserve">              </w:t>
+        <w:t xml:space="preserve">                                                                     </w:t>
       </w:r>
       <w:r>
         <w:rPr>
@@ -1109,7 +1176,7 @@
           <w:sz w:val="18"/>
           <w:szCs w:val="18"/>
         </w:rPr>
-        <w:t>|</w:t>
+        <w:t>v</w:t>
       </w:r>
     </w:p>
     <w:p>
@@ -1127,7 +1194,7 @@
           <w:sz w:val="18"/>
           <w:szCs w:val="18"/>
         </w:rPr>
-        <w:t xml:space="preserve">      </w:t>
+        <w:t xml:space="preserve">                                                              </w:t>
       </w:r>
       <w:r>
         <w:rPr>
@@ -1136,231 +1203,6 @@
           <w:sz w:val="18"/>
           <w:szCs w:val="18"/>
         </w:rPr>
-        <w:t>+------------------+                                 +---------------------+</w:t>
-      </w:r>
-    </w:p>
-    <w:p>
-      <w:pPr>
-        <w:pStyle w:val="PreformattedText"/>
-        <w:bidi w:val="0"/>
-        <w:spacing w:lineRule="auto" w:line="274" w:before="0" w:after="0"/>
-        <w:jc w:val="start"/>
-        <w:rPr/>
-      </w:pPr>
-      <w:r>
-        <w:rPr>
-          <w:rStyle w:val="SourceText"/>
-          <w:rFonts w:ascii="Hack" w:hAnsi="Hack"/>
-          <w:sz w:val="18"/>
-          <w:szCs w:val="18"/>
-        </w:rPr>
-        <w:t xml:space="preserve">      </w:t>
-      </w:r>
-      <w:r>
-        <w:rPr>
-          <w:rStyle w:val="SourceText"/>
-          <w:rFonts w:ascii="Hack" w:hAnsi="Hack"/>
-          <w:sz w:val="18"/>
-          <w:szCs w:val="18"/>
-        </w:rPr>
-        <w:t>|   850 INTERFACE  |            (2)                  |                     |</w:t>
-      </w:r>
-    </w:p>
-    <w:p>
-      <w:pPr>
-        <w:pStyle w:val="PreformattedText"/>
-        <w:bidi w:val="0"/>
-        <w:spacing w:lineRule="auto" w:line="274" w:before="0" w:after="0"/>
-        <w:jc w:val="start"/>
-        <w:rPr/>
-      </w:pPr>
-      <w:r>
-        <w:rPr>
-          <w:rStyle w:val="SourceText"/>
-          <w:rFonts w:ascii="Hack" w:hAnsi="Hack"/>
-          <w:sz w:val="18"/>
-          <w:szCs w:val="18"/>
-        </w:rPr>
-        <w:t xml:space="preserve">      </w:t>
-      </w:r>
-      <w:r>
-        <w:rPr>
-          <w:rStyle w:val="SourceText"/>
-          <w:rFonts w:ascii="Hack" w:hAnsi="Hack"/>
-          <w:sz w:val="18"/>
-          <w:szCs w:val="18"/>
-        </w:rPr>
-        <w:t>|    (R: DEVICE)   |======[ CUSTOM NULL ]===</w:t>
-      </w:r>
-      <w:r>
-        <w:rPr>
-          <w:rStyle w:val="SourceText"/>
-          <w:rFonts w:ascii="Hack" w:hAnsi="Hack"/>
-          <w:sz w:val="18"/>
-          <w:szCs w:val="18"/>
-        </w:rPr>
-        <w:t>====</w:t>
-      </w:r>
-      <w:r>
-        <w:rPr>
-          <w:rStyle w:val="SourceText"/>
-          <w:rFonts w:ascii="Hack" w:hAnsi="Hack"/>
-          <w:sz w:val="18"/>
-          <w:szCs w:val="18"/>
-        </w:rPr>
-        <w:t>=</w:t>
-      </w:r>
-      <w:r>
-        <w:rPr>
-          <w:rStyle w:val="SourceText"/>
-          <w:rFonts w:ascii="Hack" w:hAnsi="Hack"/>
-          <w:sz w:val="18"/>
-          <w:szCs w:val="18"/>
-        </w:rPr>
-        <w:t>=</w:t>
-      </w:r>
-      <w:r>
-        <w:rPr>
-          <w:rStyle w:val="SourceText"/>
-          <w:rFonts w:ascii="Hack" w:hAnsi="Hack"/>
-          <w:sz w:val="18"/>
-          <w:szCs w:val="18"/>
-        </w:rPr>
-        <w:t>==&gt;|   [ USB PORT 2 ]    |</w:t>
-      </w:r>
-    </w:p>
-    <w:p>
-      <w:pPr>
-        <w:pStyle w:val="PreformattedText"/>
-        <w:bidi w:val="0"/>
-        <w:spacing w:lineRule="auto" w:line="274" w:before="0" w:after="0"/>
-        <w:jc w:val="start"/>
-        <w:rPr/>
-      </w:pPr>
-      <w:r>
-        <w:rPr>
-          <w:rStyle w:val="SourceText"/>
-          <w:rFonts w:ascii="Hack" w:hAnsi="Hack"/>
-          <w:sz w:val="18"/>
-          <w:szCs w:val="18"/>
-        </w:rPr>
-        <w:t xml:space="preserve">      </w:t>
-      </w:r>
-      <w:r>
-        <w:rPr>
-          <w:rStyle w:val="SourceText"/>
-          <w:rFonts w:ascii="Hack" w:hAnsi="Hack"/>
-          <w:sz w:val="18"/>
-          <w:szCs w:val="18"/>
-        </w:rPr>
-        <w:t>|      PORT 1      |        MODEM CABLE              |   (Modem Bridge)    |</w:t>
-      </w:r>
-    </w:p>
-    <w:p>
-      <w:pPr>
-        <w:pStyle w:val="PreformattedText"/>
-        <w:bidi w:val="0"/>
-        <w:spacing w:lineRule="auto" w:line="274" w:before="0" w:after="0"/>
-        <w:jc w:val="start"/>
-        <w:rPr/>
-      </w:pPr>
-      <w:r>
-        <w:rPr>
-          <w:rStyle w:val="SourceText"/>
-          <w:rFonts w:ascii="Hack" w:hAnsi="Hack"/>
-          <w:sz w:val="18"/>
-          <w:szCs w:val="18"/>
-        </w:rPr>
-        <w:t xml:space="preserve">      </w:t>
-      </w:r>
-      <w:r>
-        <w:rPr>
-          <w:rStyle w:val="SourceText"/>
-          <w:rFonts w:ascii="Hack" w:hAnsi="Hack"/>
-          <w:sz w:val="18"/>
-          <w:szCs w:val="18"/>
-        </w:rPr>
-        <w:t>+------------------+                                 +---------------------+</w:t>
-      </w:r>
-    </w:p>
-    <w:p>
-      <w:pPr>
-        <w:pStyle w:val="PreformattedText"/>
-        <w:bidi w:val="0"/>
-        <w:spacing w:lineRule="auto" w:line="274" w:before="0" w:after="0"/>
-        <w:jc w:val="start"/>
-        <w:rPr/>
-      </w:pPr>
-      <w:r>
-        <w:rPr>
-          <w:rStyle w:val="SourceText"/>
-          <w:rFonts w:ascii="Hack" w:hAnsi="Hack"/>
-          <w:sz w:val="18"/>
-          <w:szCs w:val="18"/>
-        </w:rPr>
-        <w:t xml:space="preserve">                                                                     </w:t>
-      </w:r>
-      <w:r>
-        <w:rPr>
-          <w:rStyle w:val="SourceText"/>
-          <w:rFonts w:ascii="Hack" w:hAnsi="Hack"/>
-          <w:sz w:val="18"/>
-          <w:szCs w:val="18"/>
-        </w:rPr>
-        <w:t>|</w:t>
-      </w:r>
-    </w:p>
-    <w:p>
-      <w:pPr>
-        <w:pStyle w:val="PreformattedText"/>
-        <w:bidi w:val="0"/>
-        <w:spacing w:lineRule="auto" w:line="274" w:before="0" w:after="0"/>
-        <w:jc w:val="start"/>
-        <w:rPr/>
-      </w:pPr>
-      <w:r>
-        <w:rPr>
-          <w:rStyle w:val="SourceText"/>
-          <w:rFonts w:ascii="Hack" w:hAnsi="Hack"/>
-          <w:sz w:val="18"/>
-          <w:szCs w:val="18"/>
-        </w:rPr>
-        <w:t xml:space="preserve">                                                                     </w:t>
-      </w:r>
-      <w:r>
-        <w:rPr>
-          <w:rStyle w:val="SourceText"/>
-          <w:rFonts w:ascii="Hack" w:hAnsi="Hack"/>
-          <w:sz w:val="18"/>
-          <w:szCs w:val="18"/>
-        </w:rPr>
-        <w:t>v</w:t>
-      </w:r>
-    </w:p>
-    <w:p>
-      <w:pPr>
-        <w:pStyle w:val="PreformattedText"/>
-        <w:bidi w:val="0"/>
-        <w:spacing w:lineRule="auto" w:line="274" w:before="0" w:after="0"/>
-        <w:jc w:val="start"/>
-        <w:rPr/>
-      </w:pPr>
-      <w:r>
-        <w:rPr>
-          <w:rStyle w:val="SourceText"/>
-          <w:rFonts w:ascii="Hack" w:hAnsi="Hack"/>
-          <w:sz w:val="18"/>
-          <w:szCs w:val="18"/>
-        </w:rPr>
-        <w:t xml:space="preserve">                                                              </w:t>
-      </w:r>
-      <w:r>
-        <w:rPr>
-          <w:rStyle w:val="SourceText"/>
-          <w:rFonts w:ascii="Hack" w:hAnsi="Hack"/>
-          <w:sz w:val="18"/>
-          <w:szCs w:val="18"/>
-        </w:rPr>
         <w:t>( THE INTERNET )</w:t>
       </w:r>
     </w:p>
@@ -1568,28 +1410,15 @@
         <w:jc w:val="start"/>
         <w:rPr>
           <w:rFonts w:ascii="Google Sans;sans-serif" w:hAnsi="Google Sans;sans-serif"/>
+          <w:sz w:val="24"/>
+          <w:szCs w:val="24"/>
         </w:rPr>
       </w:pPr>
       <w:r>
         <w:rPr>
           <w:rFonts w:ascii="Google Sans;sans-serif" w:hAnsi="Google Sans;sans-serif"/>
-        </w:rPr>
-      </w:r>
-    </w:p>
-    <w:p>
-      <w:pPr>
-        <w:pStyle w:val="Heading3"/>
-        <w:bidi w:val="0"/>
-        <w:spacing w:lineRule="auto" w:line="274" w:before="0" w:after="140"/>
-        <w:ind w:hanging="0" w:start="0" w:end="0"/>
-        <w:jc w:val="start"/>
-        <w:rPr>
-          <w:rFonts w:ascii="Google Sans;sans-serif" w:hAnsi="Google Sans;sans-serif"/>
-        </w:rPr>
-      </w:pPr>
-      <w:r>
-        <w:rPr>
-          <w:rFonts w:ascii="Google Sans;sans-serif" w:hAnsi="Google Sans;sans-serif"/>
+          <w:sz w:val="24"/>
+          <w:szCs w:val="24"/>
         </w:rPr>
       </w:r>
       <w:r>
@@ -1746,6 +1575,7 @@
                 <w:rFonts w:ascii="Google Sans Text;sans-serif" w:hAnsi="Google Sans Text;sans-serif"/>
               </w:rPr>
               <w:t>Connection Type</w:t>
+              <w:br/>
             </w:r>
           </w:p>
         </w:tc>
@@ -1903,7 +1733,9 @@
                 <w:rFonts w:ascii="Google Sans Text;sans-serif" w:hAnsi="Google Sans Text;sans-serif"/>
                 <w:b/>
               </w:rPr>
-              <w:t>Pin 6 (DSR) + Pin 1 (CD)</w:t>
+              <w:t xml:space="preserve">Pin 6 (DSR) + </w:t>
+              <w:br/>
+              <w:t>Pin 1 (CD)</w:t>
             </w:r>
           </w:p>
         </w:tc>
@@ -1938,7 +1770,7 @@
                 <w:rFonts w:ascii="Google Sans Text;sans-serif" w:hAnsi="Google Sans Text;sans-serif"/>
                 <w:b/>
               </w:rPr>
-              <w:t>Pin 6 (DSR)</w:t>
+              <w:t>Pin 6 (DSR) + Pin 2 (CD)</w:t>
             </w:r>
           </w:p>
         </w:tc>
@@ -2718,13 +2550,51 @@
           <w:rFonts w:ascii="Google Sans Text;sans-serif" w:hAnsi="Google Sans Text;sans-serif"/>
           <w:b/>
         </w:rPr>
-        <w:t>Note on Pin 6 &amp; 1:</w:t>
-      </w:r>
-      <w:r>
-        <w:rPr>
-          <w:rFonts w:ascii="Google Sans Text;sans-serif" w:hAnsi="Google Sans Text;sans-serif"/>
-        </w:rPr>
-        <w:t xml:space="preserve"> On the PC side, bridge Pin 1 (CD) and Pin 6 (DSR) together, and connect them to the wire coming from the Atari's Pin 1 (DTR). This ensures the PC knows the Atari is ready.</w:t>
+        <w:t>Note on Loopbacks:</w:t>
+      </w:r>
+      <w:r>
+        <w:rPr>
+          <w:rFonts w:ascii="Google Sans Text;sans-serif" w:hAnsi="Google Sans Text;sans-serif"/>
+        </w:rPr>
+        <w:t xml:space="preserve"> * </w:t>
+      </w:r>
+    </w:p>
+    <w:p>
+      <w:pPr>
+        <w:pStyle w:val="BodyText"/>
+        <w:bidi w:val="0"/>
+        <w:spacing w:lineRule="auto" w:line="274" w:before="0" w:after="140"/>
+        <w:ind w:hanging="0" w:start="0" w:end="0"/>
+        <w:jc w:val="start"/>
+        <w:rPr>
+          <w:rFonts w:ascii="Google Sans Text;sans-serif" w:hAnsi="Google Sans Text;sans-serif"/>
+        </w:rPr>
+      </w:pPr>
+      <w:r>
+        <w:rPr>
+          <w:rFonts w:ascii="Google Sans Text;sans-serif" w:hAnsi="Google Sans Text;sans-serif"/>
+          <w:b/>
+        </w:rPr>
+        <w:t>On the PC side:</w:t>
+      </w:r>
+      <w:r>
+        <w:rPr>
+          <w:rFonts w:ascii="Google Sans Text;sans-serif" w:hAnsi="Google Sans Text;sans-serif"/>
+        </w:rPr>
+        <w:t xml:space="preserve"> Bridge Pin 1 (CD) and Pin 6 (DSR) together, and connect them to the wire coming from the Atari's Pin 1 (DTR). This ensures the PC knows the Atari is ready.  </w:t>
+      </w:r>
+      <w:r>
+        <w:rPr>
+          <w:rFonts w:ascii="Google Sans Text;sans-serif" w:hAnsi="Google Sans Text;sans-serif"/>
+          <w:b/>
+        </w:rPr>
+        <w:t>On the Atari side:</w:t>
+      </w:r>
+      <w:r>
+        <w:rPr>
+          <w:rFonts w:ascii="Google Sans Text;sans-serif" w:hAnsi="Google Sans Text;sans-serif"/>
+        </w:rPr>
+        <w:t xml:space="preserve"> Bridge Pin 2 (CD) and Pin 6 (DSR) together, and connect them to the wire coming from the PC's Pin 4 (DTR). This ensures the Atari 850 detects a valid carrier tone and opens the port for data.</w:t>
       </w:r>
     </w:p>
     <w:p>
@@ -2896,6 +2766,34 @@
           <w:rFonts w:ascii="Google Sans Text;sans-serif" w:hAnsi="Google Sans Text;sans-serif"/>
         </w:rPr>
         <w:t xml:space="preserve"> (NOT the SIO2PC adapter).</w:t>
+        <w:br/>
+      </w:r>
+      <w:r>
+        <w:br w:type="page"/>
+      </w:r>
+    </w:p>
+    <w:p>
+      <w:pPr>
+        <w:pStyle w:val="BodyText"/>
+        <w:numPr>
+          <w:ilvl w:val="0"/>
+          <w:numId w:val="0"/>
+        </w:numPr>
+        <w:tabs>
+          <w:tab w:val="left" w:pos="709" w:leader="none"/>
+        </w:tabs>
+        <w:bidi w:val="0"/>
+        <w:spacing w:lineRule="auto" w:line="274" w:before="0" w:after="140"/>
+        <w:ind w:hanging="0" w:start="709" w:end="0"/>
+        <w:jc w:val="start"/>
+        <w:rPr>
+          <w:rFonts w:ascii="Google Sans Text;sans-serif" w:hAnsi="Google Sans Text;sans-serif"/>
+        </w:rPr>
+      </w:pPr>
+      <w:r>
+        <w:rPr>
+          <w:rFonts w:ascii="Google Sans Text;sans-serif" w:hAnsi="Google Sans Text;sans-serif"/>
+        </w:rPr>
       </w:r>
     </w:p>
     <w:p>
@@ -3250,14 +3148,14 @@
         </w:tblCellMar>
       </w:tblPr>
       <w:tblGrid>
-        <w:gridCol w:w="1806"/>
-        <w:gridCol w:w="8165"/>
+        <w:gridCol w:w="1802"/>
+        <w:gridCol w:w="8169"/>
       </w:tblGrid>
       <w:tr>
         <w:trPr/>
         <w:tc>
           <w:tcPr>
-            <w:tcW w:w="1806" w:type="dxa"/>
+            <w:tcW w:w="1802" w:type="dxa"/>
             <w:tcBorders>
               <w:top w:val="single" w:sz="6" w:space="0" w:color="808080"/>
               <w:start w:val="single" w:sz="6" w:space="0" w:color="808080"/>
@@ -3281,7 +3179,7 @@
         </w:tc>
         <w:tc>
           <w:tcPr>
-            <w:tcW w:w="8165" w:type="dxa"/>
+            <w:tcW w:w="8169" w:type="dxa"/>
             <w:tcBorders>
               <w:top w:val="single" w:sz="6" w:space="0" w:color="808080"/>
               <w:start w:val="single" w:sz="2" w:space="0" w:color="808080"/>
@@ -3307,7 +3205,7 @@
         <w:trPr/>
         <w:tc>
           <w:tcPr>
-            <w:tcW w:w="1806" w:type="dxa"/>
+            <w:tcW w:w="1802" w:type="dxa"/>
             <w:tcBorders>
               <w:start w:val="single" w:sz="6" w:space="0" w:color="808080"/>
               <w:bottom w:val="single" w:sz="2" w:space="0" w:color="808080"/>
@@ -3332,7 +3230,7 @@
         </w:tc>
         <w:tc>
           <w:tcPr>
-            <w:tcW w:w="8165" w:type="dxa"/>
+            <w:tcW w:w="8169" w:type="dxa"/>
             <w:tcBorders>
               <w:start w:val="single" w:sz="2" w:space="0" w:color="808080"/>
               <w:bottom w:val="single" w:sz="2" w:space="0" w:color="808080"/>
@@ -3363,7 +3261,7 @@
         <w:trPr/>
         <w:tc>
           <w:tcPr>
-            <w:tcW w:w="1806" w:type="dxa"/>
+            <w:tcW w:w="1802" w:type="dxa"/>
             <w:tcBorders>
               <w:start w:val="single" w:sz="6" w:space="0" w:color="808080"/>
               <w:bottom w:val="single" w:sz="2" w:space="0" w:color="808080"/>
@@ -3388,7 +3286,7 @@
         </w:tc>
         <w:tc>
           <w:tcPr>
-            <w:tcW w:w="8165" w:type="dxa"/>
+            <w:tcW w:w="8169" w:type="dxa"/>
             <w:tcBorders>
               <w:start w:val="single" w:sz="2" w:space="0" w:color="808080"/>
               <w:bottom w:val="single" w:sz="2" w:space="0" w:color="808080"/>
@@ -3422,7 +3320,7 @@
         <w:trPr/>
         <w:tc>
           <w:tcPr>
-            <w:tcW w:w="1806" w:type="dxa"/>
+            <w:tcW w:w="1802" w:type="dxa"/>
             <w:tcBorders>
               <w:start w:val="single" w:sz="6" w:space="0" w:color="808080"/>
               <w:bottom w:val="single" w:sz="2" w:space="0" w:color="808080"/>
@@ -3447,7 +3345,7 @@
         </w:tc>
         <w:tc>
           <w:tcPr>
-            <w:tcW w:w="8165" w:type="dxa"/>
+            <w:tcW w:w="8169" w:type="dxa"/>
             <w:tcBorders>
               <w:start w:val="single" w:sz="2" w:space="0" w:color="808080"/>
               <w:bottom w:val="single" w:sz="2" w:space="0" w:color="808080"/>
@@ -3496,7 +3394,7 @@
         <w:trPr/>
         <w:tc>
           <w:tcPr>
-            <w:tcW w:w="1806" w:type="dxa"/>
+            <w:tcW w:w="1802" w:type="dxa"/>
             <w:tcBorders>
               <w:start w:val="single" w:sz="6" w:space="0" w:color="808080"/>
               <w:bottom w:val="single" w:sz="2" w:space="0" w:color="808080"/>
@@ -3521,7 +3419,7 @@
         </w:tc>
         <w:tc>
           <w:tcPr>
-            <w:tcW w:w="8165" w:type="dxa"/>
+            <w:tcW w:w="8169" w:type="dxa"/>
             <w:tcBorders>
               <w:start w:val="single" w:sz="2" w:space="0" w:color="808080"/>
               <w:bottom w:val="single" w:sz="2" w:space="0" w:color="808080"/>
@@ -3566,7 +3464,7 @@
         <w:trPr/>
         <w:tc>
           <w:tcPr>
-            <w:tcW w:w="1806" w:type="dxa"/>
+            <w:tcW w:w="1802" w:type="dxa"/>
             <w:tcBorders>
               <w:start w:val="single" w:sz="6" w:space="0" w:color="808080"/>
               <w:bottom w:val="single" w:sz="2" w:space="0" w:color="808080"/>
@@ -3591,7 +3489,7 @@
         </w:tc>
         <w:tc>
           <w:tcPr>
-            <w:tcW w:w="8165" w:type="dxa"/>
+            <w:tcW w:w="8169" w:type="dxa"/>
             <w:tcBorders>
               <w:start w:val="single" w:sz="2" w:space="0" w:color="808080"/>
               <w:bottom w:val="single" w:sz="2" w:space="0" w:color="808080"/>
@@ -3636,7 +3534,7 @@
         <w:trPr/>
         <w:tc>
           <w:tcPr>
-            <w:tcW w:w="1806" w:type="dxa"/>
+            <w:tcW w:w="1802" w:type="dxa"/>
             <w:tcBorders>
               <w:start w:val="single" w:sz="6" w:space="0" w:color="808080"/>
               <w:bottom w:val="single" w:sz="6" w:space="0" w:color="808080"/>
@@ -3661,7 +3559,7 @@
         </w:tc>
         <w:tc>
           <w:tcPr>
-            <w:tcW w:w="8165" w:type="dxa"/>
+            <w:tcW w:w="8169" w:type="dxa"/>
             <w:tcBorders>
               <w:start w:val="single" w:sz="2" w:space="0" w:color="808080"/>
               <w:bottom w:val="single" w:sz="6" w:space="0" w:color="808080"/>
@@ -4112,6 +4010,18 @@
         <w:spacing w:lineRule="auto" w:line="274" w:before="0" w:after="140"/>
         <w:ind w:hanging="283" w:start="1418" w:end="0"/>
         <w:jc w:val="start"/>
+        <w:rPr>
+          <w:rFonts w:ascii="Segoe UI Semilight;Segoe UI;Helvetica Neue;Helvetica;Arial;sans-serif" w:hAnsi="Segoe UI Semilight;Segoe UI;Helvetica Neue;Helvetica;Arial;sans-serif"/>
+          <w:b w:val="false"/>
+          <w:i w:val="false"/>
+          <w:i w:val="false"/>
+          <w:caps w:val="false"/>
+          <w:smallCaps w:val="false"/>
+          <w:spacing w:val="0"/>
+          <w:sz w:val="21"/>
+        </w:rPr>
+      </w:pPr>
+      <w:r>
         <w:rPr>
           <w:rFonts w:ascii="Segoe UI Semilight;Segoe UI;Helvetica Neue;Helvetica;Arial;sans-serif" w:hAnsi="Segoe UI Semilight;Segoe UI;Helvetica Neue;Helvetica;Arial;sans-serif"/>
           <w:b w:val="false"/>
@@ -4120,11 +4030,6 @@
           <w:smallCaps w:val="false"/>
           <w:spacing w:val="0"/>
           <w:sz w:val="21"/>
-        </w:rPr>
-      </w:pPr>
-      <w:r>
-        <w:rPr>
-          <w:rFonts w:ascii="Google Sans Text;sans-serif" w:hAnsi="Google Sans Text;sans-serif"/>
         </w:rPr>
       </w:r>
     </w:p>
@@ -4263,6 +4168,27 @@
           <w:rFonts w:ascii="Google Sans Text;sans-serif" w:hAnsi="Google Sans Text;sans-serif"/>
         </w:rPr>
         <w:t>The bridge emulates a standard Hayes-compatible modem. You can issue these commands from any Atari terminal program.</w:t>
+      </w:r>
+    </w:p>
+    <w:p>
+      <w:pPr>
+        <w:pStyle w:val="BodyText"/>
+        <w:bidi w:val="0"/>
+        <w:spacing w:lineRule="auto" w:line="274" w:before="0" w:after="140"/>
+        <w:ind w:hanging="0" w:start="0" w:end="0"/>
+        <w:jc w:val="start"/>
+        <w:rPr>
+          <w:rFonts w:ascii="Google Sans Text;sans-serif" w:hAnsi="Google Sans Text;sans-serif"/>
+        </w:rPr>
+      </w:pPr>
+      <w:r>
+        <w:rPr>
+          <w:rFonts w:ascii="Google Sans Text;sans-serif" w:hAnsi="Google Sans Text;sans-serif"/>
+        </w:rPr>
+        <w:br/>
+      </w:r>
+      <w:r>
+        <w:br w:type="page"/>
       </w:r>
     </w:p>
     <w:p>
@@ -4853,30 +4779,6 @@
           <w:sz w:val="24"/>
           <w:szCs w:val="24"/>
         </w:rPr>
-      </w:r>
-      <w:r>
-        <w:br w:type="page"/>
-      </w:r>
-    </w:p>
-    <w:p>
-      <w:pPr>
-        <w:pStyle w:val="Heading3"/>
-        <w:bidi w:val="0"/>
-        <w:spacing w:lineRule="auto" w:line="274" w:before="0" w:after="140"/>
-        <w:ind w:hanging="0" w:start="0" w:end="0"/>
-        <w:jc w:val="start"/>
-        <w:rPr>
-          <w:rFonts w:ascii="Google Sans;sans-serif" w:hAnsi="Google Sans;sans-serif"/>
-          <w:sz w:val="24"/>
-          <w:szCs w:val="24"/>
-        </w:rPr>
-      </w:pPr>
-      <w:r>
-        <w:rPr>
-          <w:rFonts w:ascii="Google Sans;sans-serif" w:hAnsi="Google Sans;sans-serif"/>
-          <w:sz w:val="24"/>
-          <w:szCs w:val="24"/>
-        </w:rPr>
         <w:t>Special Macros &amp; Features</w:t>
       </w:r>
     </w:p>
@@ -5520,30 +5422,6 @@
           <w:sz w:val="24"/>
           <w:szCs w:val="24"/>
         </w:rPr>
-      </w:r>
-      <w:r>
-        <w:br w:type="page"/>
-      </w:r>
-    </w:p>
-    <w:p>
-      <w:pPr>
-        <w:pStyle w:val="Heading2"/>
-        <w:bidi w:val="0"/>
-        <w:spacing w:lineRule="auto" w:line="274" w:before="0" w:after="140"/>
-        <w:ind w:hanging="0" w:start="0" w:end="0"/>
-        <w:jc w:val="start"/>
-        <w:rPr>
-          <w:rFonts w:ascii="Google Sans;sans-serif" w:hAnsi="Google Sans;sans-serif"/>
-          <w:sz w:val="24"/>
-          <w:szCs w:val="24"/>
-        </w:rPr>
-      </w:pPr>
-      <w:r>
-        <w:rPr>
-          <w:rFonts w:ascii="Google Sans;sans-serif" w:hAnsi="Google Sans;sans-serif"/>
-          <w:sz w:val="24"/>
-          <w:szCs w:val="24"/>
-        </w:rPr>
         <w:t>7. Troubleshooting</w:t>
       </w:r>
     </w:p>
@@ -5834,11 +5712,2068 @@
         <w:rPr/>
       </w:r>
     </w:p>
+    <w:p>
+      <w:pPr>
+        <w:pStyle w:val="Normal"/>
+        <w:bidi w:val="0"/>
+        <w:jc w:val="start"/>
+        <w:rPr/>
+      </w:pPr>
+      <w:r>
+        <w:rPr/>
+      </w:r>
+    </w:p>
+    <w:p>
+      <w:pPr>
+        <w:pStyle w:val="Normal"/>
+        <w:bidi w:val="0"/>
+        <w:jc w:val="start"/>
+        <w:rPr/>
+      </w:pPr>
+      <w:r>
+        <w:rPr/>
+        <w:t xml:space="preserve"> </w:t>
+      </w:r>
+    </w:p>
+    <w:p>
+      <w:pPr>
+        <w:pStyle w:val="Normal"/>
+        <w:bidi w:val="0"/>
+        <w:jc w:val="start"/>
+        <w:rPr/>
+      </w:pPr>
+      <w:r>
+        <w:rPr/>
+      </w:r>
+    </w:p>
+    <w:p>
+      <w:pPr>
+        <w:pStyle w:val="Heading3"/>
+        <w:bidi w:val="0"/>
+        <w:spacing w:before="0" w:after="283"/>
+        <w:ind w:hanging="0" w:start="0" w:end="0"/>
+        <w:jc w:val="start"/>
+        <w:rPr>
+          <w:sz w:val="24"/>
+          <w:szCs w:val="24"/>
+        </w:rPr>
+      </w:pPr>
+      <w:r>
+        <w:rPr>
+          <w:sz w:val="24"/>
+          <w:szCs w:val="24"/>
+        </w:rPr>
+      </w:r>
+      <w:r>
+        <w:br w:type="page"/>
+      </w:r>
+    </w:p>
+    <w:p>
+      <w:pPr>
+        <w:pStyle w:val="Heading3"/>
+        <w:bidi w:val="0"/>
+        <w:spacing w:before="0" w:after="283"/>
+        <w:ind w:hanging="0" w:start="0" w:end="0"/>
+        <w:jc w:val="start"/>
+        <w:rPr>
+          <w:sz w:val="24"/>
+          <w:szCs w:val="24"/>
+        </w:rPr>
+      </w:pPr>
+      <w:r>
+        <w:rPr>
+          <w:sz w:val="24"/>
+          <w:szCs w:val="24"/>
+        </w:rPr>
+        <w:t>8. Raspberry Pi Implementation (Direct UART)</w:t>
+      </w:r>
+    </w:p>
+    <w:p>
+      <w:pPr>
+        <w:pStyle w:val="BodyText"/>
+        <w:bidi w:val="0"/>
+        <w:spacing w:before="0" w:after="283"/>
+        <w:ind w:hanging="0" w:start="0" w:end="0"/>
+        <w:jc w:val="start"/>
+        <w:rPr>
+          <w:sz w:val="24"/>
+          <w:szCs w:val="24"/>
+        </w:rPr>
+      </w:pPr>
+      <w:r>
+        <w:rPr>
+          <w:sz w:val="24"/>
+          <w:szCs w:val="24"/>
+        </w:rPr>
+      </w:r>
+    </w:p>
+    <w:p>
+      <w:pPr>
+        <w:sectPr>
+          <w:type w:val="nextPage"/>
+          <w:pgSz w:w="12240" w:h="15840"/>
+          <w:pgMar w:left="1134" w:right="1134" w:gutter="0" w:header="0" w:top="1134" w:footer="0" w:bottom="1134"/>
+          <w:pgNumType w:fmt="decimal"/>
+          <w:formProt w:val="false"/>
+          <w:textDirection w:val="lrTb"/>
+          <w:docGrid w:type="default" w:linePitch="100" w:charSpace="0"/>
+        </w:sectPr>
+      </w:pPr>
+    </w:p>
+    <w:p>
+      <w:pPr>
+        <w:pStyle w:val="BodyText"/>
+        <w:rPr/>
+      </w:pPr>
+      <w:r>
+        <w:rPr/>
+        <w:t>This section details the configuration for users running AspeQt-2k26 directly on a Raspberry Pi. In this configuration, the Raspberry Pi acts as both the host for the emulator and the physical modem interface.</w:t>
+      </w:r>
+    </w:p>
+    <w:p>
+      <w:pPr>
+        <w:pStyle w:val="Heading4"/>
+        <w:spacing w:before="0" w:after="283"/>
+        <w:rPr/>
+      </w:pPr>
+      <w:r>
+        <w:rPr/>
+      </w:r>
+    </w:p>
+    <w:p>
+      <w:pPr>
+        <w:pStyle w:val="Heading4"/>
+        <w:spacing w:before="0" w:after="283"/>
+        <w:rPr/>
+      </w:pPr>
+      <w:r>
+        <w:rPr/>
+        <w:t>8.1 Hardware Architecture (Pi Edition)</w:t>
+      </w:r>
+    </w:p>
+    <w:p>
+      <w:pPr>
+        <w:pStyle w:val="BodyText"/>
+        <w:rPr/>
+      </w:pPr>
+      <w:r>
+        <w:rPr/>
+        <w:t>Unlike the PC setup which requires two USB cables, this setup utilizes the Pi's built-in GPIO pins for the modem connection.</w:t>
+      </w:r>
+    </w:p>
+    <w:p>
+      <w:pPr>
+        <w:pStyle w:val="BodyText"/>
+        <w:numPr>
+          <w:ilvl w:val="0"/>
+          <w:numId w:val="8"/>
+        </w:numPr>
+        <w:tabs>
+          <w:tab w:val="clear" w:pos="709"/>
+          <w:tab w:val="left" w:pos="0" w:leader="none"/>
+        </w:tabs>
+        <w:ind w:hanging="283" w:start="709" w:end="0"/>
+        <w:rPr/>
+      </w:pPr>
+      <w:r>
+        <w:rPr>
+          <w:b/>
+        </w:rPr>
+        <w:t>Disk I/O Path:</w:t>
+      </w:r>
+      <w:r>
+        <w:rPr/>
+        <w:t xml:space="preserve"> Atari SIO → SIO2PC → </w:t>
+      </w:r>
+      <w:r>
+        <w:rPr>
+          <w:b/>
+        </w:rPr>
+        <w:t>Raspberry Pi USB Port</w:t>
+      </w:r>
+    </w:p>
+    <w:p>
+      <w:pPr>
+        <w:pStyle w:val="BodyText"/>
+        <w:numPr>
+          <w:ilvl w:val="1"/>
+          <w:numId w:val="8"/>
+        </w:numPr>
+        <w:tabs>
+          <w:tab w:val="clear" w:pos="709"/>
+          <w:tab w:val="left" w:pos="0" w:leader="none"/>
+        </w:tabs>
+        <w:ind w:hanging="283" w:start="1418"/>
+        <w:rPr/>
+      </w:pPr>
+      <w:r>
+        <w:rPr>
+          <w:i/>
+        </w:rPr>
+        <w:t>Function:</w:t>
+      </w:r>
+      <w:r>
+        <w:rPr/>
+        <w:t xml:space="preserve"> Handles standard disk drives (D1:-D8:).</w:t>
+      </w:r>
+    </w:p>
+    <w:p>
+      <w:pPr>
+        <w:pStyle w:val="BodyText"/>
+        <w:numPr>
+          <w:ilvl w:val="0"/>
+          <w:numId w:val="8"/>
+        </w:numPr>
+        <w:tabs>
+          <w:tab w:val="clear" w:pos="709"/>
+          <w:tab w:val="left" w:pos="0" w:leader="none"/>
+        </w:tabs>
+        <w:ind w:hanging="283" w:start="709" w:end="0"/>
+        <w:rPr/>
+      </w:pPr>
+      <w:r>
+        <w:rPr>
+          <w:b/>
+        </w:rPr>
+        <w:t>Modem Path:</w:t>
+      </w:r>
+      <w:r>
+        <w:rPr/>
+        <w:t xml:space="preserve"> Atari 850 (Port 1) → Level Shifter → </w:t>
+      </w:r>
+      <w:r>
+        <w:rPr>
+          <w:b/>
+        </w:rPr>
+        <w:t>Raspberry Pi GPIO Header</w:t>
+      </w:r>
+    </w:p>
+    <w:p>
+      <w:pPr>
+        <w:pStyle w:val="BodyText"/>
+        <w:numPr>
+          <w:ilvl w:val="1"/>
+          <w:numId w:val="8"/>
+        </w:numPr>
+        <w:tabs>
+          <w:tab w:val="clear" w:pos="709"/>
+          <w:tab w:val="left" w:pos="0" w:leader="none"/>
+        </w:tabs>
+        <w:ind w:hanging="283" w:start="1418"/>
+        <w:rPr/>
+      </w:pPr>
+      <w:r>
+        <w:rPr>
+          <w:i/>
+        </w:rPr>
+        <w:t>Function:</w:t>
+      </w:r>
+      <w:r>
+        <w:rPr/>
+        <w:t xml:space="preserve"> Handles R: (The Modem Bridge).</w:t>
+      </w:r>
+    </w:p>
+    <w:p>
+      <w:pPr>
+        <w:pStyle w:val="Heading4"/>
+        <w:spacing w:before="0" w:after="283"/>
+        <w:rPr/>
+      </w:pPr>
+      <w:r>
+        <w:rPr/>
+      </w:r>
+    </w:p>
+    <w:p>
+      <w:pPr>
+        <w:pStyle w:val="Heading4"/>
+        <w:spacing w:before="0" w:after="283"/>
+        <w:rPr/>
+      </w:pPr>
+      <w:r>
+        <w:rPr/>
+        <w:t>8.2 The "Voltage Hazard" Warning</w:t>
+      </w:r>
+    </w:p>
+    <w:p>
+      <w:pPr>
+        <w:pStyle w:val="BodyText"/>
+        <w:ind w:hanging="0" w:start="0" w:end="0"/>
+        <w:rPr/>
+      </w:pPr>
+      <w:r>
+        <w:rPr>
+          <w:b/>
+        </w:rPr>
+        <w:t xml:space="preserve">     </w:t>
+      </w:r>
+      <w:r>
+        <w:rPr>
+          <w:b/>
+        </w:rPr>
+        <w:t>* * CRITICAL:</w:t>
+      </w:r>
+      <w:r>
+        <w:rPr/>
+        <w:t xml:space="preserve"> The Atari 850 uses RS-232 voltage levels (±12V). The Raspberry Pi GPIO uses 3.3V TTL logic.</w:t>
+      </w:r>
+    </w:p>
+    <w:p>
+      <w:pPr>
+        <w:pStyle w:val="BodyText"/>
+        <w:ind w:hanging="0" w:start="0" w:end="0"/>
+        <w:rPr/>
+      </w:pPr>
+      <w:r>
+        <w:rPr/>
+      </w:r>
+    </w:p>
+    <w:p>
+      <w:pPr>
+        <w:pStyle w:val="BodyText"/>
+        <w:numPr>
+          <w:ilvl w:val="0"/>
+          <w:numId w:val="9"/>
+        </w:numPr>
+        <w:tabs>
+          <w:tab w:val="clear" w:pos="709"/>
+          <w:tab w:val="left" w:pos="0" w:leader="none"/>
+        </w:tabs>
+        <w:ind w:hanging="283" w:start="709"/>
+        <w:rPr/>
+      </w:pPr>
+      <w:r>
+        <w:rPr>
+          <w:b/>
+        </w:rPr>
+        <w:t>DO NOT</w:t>
+      </w:r>
+      <w:r>
+        <w:rPr/>
+        <w:t xml:space="preserve"> connect the Atari 850 directly to the Raspberry Pi.</w:t>
+      </w:r>
+    </w:p>
+    <w:p>
+      <w:pPr>
+        <w:pStyle w:val="BodyText"/>
+        <w:numPr>
+          <w:ilvl w:val="0"/>
+          <w:numId w:val="9"/>
+        </w:numPr>
+        <w:tabs>
+          <w:tab w:val="clear" w:pos="709"/>
+          <w:tab w:val="left" w:pos="0" w:leader="none"/>
+        </w:tabs>
+        <w:ind w:hanging="283" w:start="709"/>
+        <w:rPr/>
+      </w:pPr>
+      <w:r>
+        <w:rPr>
+          <w:b/>
+        </w:rPr>
+        <w:t>YOU MUST</w:t>
+      </w:r>
+      <w:r>
+        <w:rPr/>
+        <w:t xml:space="preserve"> use a 3.3V RS-232 to TTL Level Shifter (e.g., MAX3232) to bridge the connection. Direct connection will permanently damage the Pi.</w:t>
+      </w:r>
+    </w:p>
+    <w:p>
+      <w:pPr>
+        <w:pStyle w:val="Heading4"/>
+        <w:spacing w:before="0" w:after="283"/>
+        <w:rPr/>
+      </w:pPr>
+      <w:r>
+        <w:rPr/>
+      </w:r>
+    </w:p>
+    <w:p>
+      <w:pPr>
+        <w:pStyle w:val="Heading4"/>
+        <w:spacing w:before="0" w:after="283"/>
+        <w:rPr/>
+      </w:pPr>
+      <w:r>
+        <w:rPr/>
+      </w:r>
+      <w:r>
+        <w:br w:type="page"/>
+      </w:r>
+    </w:p>
+    <w:p>
+      <w:pPr>
+        <w:pStyle w:val="Heading4"/>
+        <w:spacing w:before="0" w:after="283"/>
+        <w:rPr/>
+      </w:pPr>
+      <w:r>
+        <w:rPr/>
+        <w:t>8.3 Wiring: Pi GPIO to Atari 850 (Port 1)</w:t>
+      </w:r>
+    </w:p>
+    <w:p>
+      <w:pPr>
+        <w:pStyle w:val="BodyText"/>
+        <w:rPr/>
+      </w:pPr>
+      <w:r>
+        <w:rPr/>
+        <w:t>Since the Raspberry Pi UART lacks standard DTR/DSR control pins, we utilize a "Local Loopback" on the Atari side to trick the 850 into detecting a "Ready" modem.</w:t>
+      </w:r>
+    </w:p>
+    <w:p>
+      <w:pPr>
+        <w:pStyle w:val="BodyText"/>
+        <w:rPr>
+          <w:b/>
+        </w:rPr>
+      </w:pPr>
+      <w:r>
+        <w:rPr>
+          <w:b/>
+        </w:rPr>
+      </w:r>
+    </w:p>
+    <w:p>
+      <w:pPr>
+        <w:pStyle w:val="BodyText"/>
+        <w:rPr>
+          <w:b/>
+        </w:rPr>
+      </w:pPr>
+      <w:r>
+        <w:rPr>
+          <w:b/>
+        </w:rPr>
+        <w:t>Pinout Table (MAX3232 Shifter Intermediate)</w:t>
+      </w:r>
+    </w:p>
+    <w:p>
+      <w:pPr>
+        <w:pStyle w:val="BodyText"/>
+        <w:rPr>
+          <w:b/>
+        </w:rPr>
+      </w:pPr>
+      <w:r>
+        <w:rPr>
+          <w:b/>
+        </w:rPr>
+      </w:r>
+    </w:p>
+    <w:tbl>
+      <w:tblPr>
+        <w:tblW w:w="9972" w:type="dxa"/>
+        <w:jc w:val="start"/>
+        <w:tblInd w:w="0" w:type="dxa"/>
+        <w:tblLayout w:type="fixed"/>
+        <w:tblCellMar>
+          <w:top w:w="28" w:type="dxa"/>
+          <w:start w:w="28" w:type="dxa"/>
+          <w:bottom w:w="28" w:type="dxa"/>
+          <w:end w:w="28" w:type="dxa"/>
+        </w:tblCellMar>
+      </w:tblPr>
+      <w:tblGrid>
+        <w:gridCol w:w="1797"/>
+        <w:gridCol w:w="1654"/>
+        <w:gridCol w:w="1674"/>
+        <w:gridCol w:w="2015"/>
+        <w:gridCol w:w="2832"/>
+      </w:tblGrid>
+      <w:tr>
+        <w:trPr>
+          <w:tblHeader w:val="true"/>
+        </w:trPr>
+        <w:tc>
+          <w:tcPr>
+            <w:tcW w:w="1797" w:type="dxa"/>
+            <w:tcBorders/>
+            <w:vAlign w:val="center"/>
+          </w:tcPr>
+          <w:p>
+            <w:pPr>
+              <w:pStyle w:val="TableContents"/>
+              <w:rPr/>
+            </w:pPr>
+            <w:r>
+              <w:rPr/>
+              <w:t>Signal Function</w:t>
+            </w:r>
+          </w:p>
+        </w:tc>
+        <w:tc>
+          <w:tcPr>
+            <w:tcW w:w="1654" w:type="dxa"/>
+            <w:tcBorders/>
+            <w:vAlign w:val="center"/>
+          </w:tcPr>
+          <w:p>
+            <w:pPr>
+              <w:pStyle w:val="TableContents"/>
+              <w:rPr/>
+            </w:pPr>
+            <w:r>
+              <w:rPr/>
+              <w:t xml:space="preserve">Atari 850 </w:t>
+            </w:r>
+          </w:p>
+          <w:p>
+            <w:pPr>
+              <w:pStyle w:val="TableContents"/>
+              <w:rPr/>
+            </w:pPr>
+            <w:r>
+              <w:rPr/>
+              <w:t>(DB9 Pin)</w:t>
+            </w:r>
+          </w:p>
+        </w:tc>
+        <w:tc>
+          <w:tcPr>
+            <w:tcW w:w="1674" w:type="dxa"/>
+            <w:tcBorders/>
+            <w:vAlign w:val="center"/>
+          </w:tcPr>
+          <w:p>
+            <w:pPr>
+              <w:pStyle w:val="TableContents"/>
+              <w:rPr/>
+            </w:pPr>
+            <w:r>
+              <w:rPr/>
+              <w:t>Direction</w:t>
+            </w:r>
+          </w:p>
+        </w:tc>
+        <w:tc>
+          <w:tcPr>
+            <w:tcW w:w="2015" w:type="dxa"/>
+            <w:tcBorders/>
+            <w:vAlign w:val="center"/>
+          </w:tcPr>
+          <w:p>
+            <w:pPr>
+              <w:pStyle w:val="TableContents"/>
+              <w:rPr/>
+            </w:pPr>
+            <w:r>
+              <w:rPr/>
+              <w:t xml:space="preserve">Level Shifter </w:t>
+            </w:r>
+          </w:p>
+          <w:p>
+            <w:pPr>
+              <w:pStyle w:val="TableContents"/>
+              <w:rPr/>
+            </w:pPr>
+            <w:r>
+              <w:rPr/>
+              <w:t>(TTL Side)</w:t>
+            </w:r>
+          </w:p>
+        </w:tc>
+        <w:tc>
+          <w:tcPr>
+            <w:tcW w:w="2832" w:type="dxa"/>
+            <w:tcBorders/>
+            <w:vAlign w:val="center"/>
+          </w:tcPr>
+          <w:p>
+            <w:pPr>
+              <w:pStyle w:val="TableContents"/>
+              <w:rPr/>
+            </w:pPr>
+            <w:r>
+              <w:rPr/>
+              <w:t>Raspberry Pi GPIO</w:t>
+            </w:r>
+          </w:p>
+        </w:tc>
+      </w:tr>
+      <w:tr>
+        <w:trPr/>
+        <w:tc>
+          <w:tcPr>
+            <w:tcW w:w="1797" w:type="dxa"/>
+            <w:tcBorders/>
+            <w:vAlign w:val="center"/>
+          </w:tcPr>
+          <w:p>
+            <w:pPr>
+              <w:pStyle w:val="TableContents"/>
+              <w:rPr>
+                <w:b/>
+              </w:rPr>
+            </w:pPr>
+            <w:r>
+              <w:rPr>
+                <w:b/>
+              </w:rPr>
+              <w:t>Transmit Data</w:t>
+            </w:r>
+          </w:p>
+        </w:tc>
+        <w:tc>
+          <w:tcPr>
+            <w:tcW w:w="1654" w:type="dxa"/>
+            <w:tcBorders/>
+            <w:vAlign w:val="center"/>
+          </w:tcPr>
+          <w:p>
+            <w:pPr>
+              <w:pStyle w:val="TableContents"/>
+              <w:rPr/>
+            </w:pPr>
+            <w:r>
+              <w:rPr>
+                <w:b/>
+              </w:rPr>
+              <w:t>Pin 3</w:t>
+            </w:r>
+            <w:r>
+              <w:rPr/>
+              <w:t xml:space="preserve"> (TX)</w:t>
+            </w:r>
+          </w:p>
+        </w:tc>
+        <w:tc>
+          <w:tcPr>
+            <w:tcW w:w="1674" w:type="dxa"/>
+            <w:tcBorders/>
+            <w:vAlign w:val="center"/>
+          </w:tcPr>
+          <w:p>
+            <w:pPr>
+              <w:pStyle w:val="TableContents"/>
+              <w:ind w:hanging="0" w:start="0" w:end="0"/>
+              <w:rPr/>
+            </w:pPr>
+            <w:r>
+              <w:rPr/>
+              <w:t>Atari → Pi</w:t>
+            </w:r>
+          </w:p>
+        </w:tc>
+        <w:tc>
+          <w:tcPr>
+            <w:tcW w:w="2015" w:type="dxa"/>
+            <w:tcBorders/>
+            <w:vAlign w:val="center"/>
+          </w:tcPr>
+          <w:p>
+            <w:pPr>
+              <w:pStyle w:val="TableContents"/>
+              <w:ind w:hanging="0" w:start="0" w:end="0"/>
+              <w:rPr/>
+            </w:pPr>
+            <w:r>
+              <w:rPr/>
+              <w:t>T2IN → T2OUT</w:t>
+            </w:r>
+          </w:p>
+        </w:tc>
+        <w:tc>
+          <w:tcPr>
+            <w:tcW w:w="2832" w:type="dxa"/>
+            <w:tcBorders/>
+            <w:vAlign w:val="center"/>
+          </w:tcPr>
+          <w:p>
+            <w:pPr>
+              <w:pStyle w:val="TableContents"/>
+              <w:rPr/>
+            </w:pPr>
+            <w:r>
+              <w:rPr>
+                <w:b/>
+              </w:rPr>
+              <w:t>GPIO 15</w:t>
+            </w:r>
+            <w:r>
+              <w:rPr/>
+              <w:t xml:space="preserve"> (RXD) - Pin 10</w:t>
+            </w:r>
+          </w:p>
+        </w:tc>
+      </w:tr>
+      <w:tr>
+        <w:trPr/>
+        <w:tc>
+          <w:tcPr>
+            <w:tcW w:w="1797" w:type="dxa"/>
+            <w:tcBorders/>
+            <w:vAlign w:val="center"/>
+          </w:tcPr>
+          <w:p>
+            <w:pPr>
+              <w:pStyle w:val="TableContents"/>
+              <w:rPr>
+                <w:b/>
+              </w:rPr>
+            </w:pPr>
+            <w:r>
+              <w:rPr>
+                <w:b/>
+              </w:rPr>
+              <w:t>Receive Data</w:t>
+            </w:r>
+          </w:p>
+        </w:tc>
+        <w:tc>
+          <w:tcPr>
+            <w:tcW w:w="1654" w:type="dxa"/>
+            <w:tcBorders/>
+            <w:vAlign w:val="center"/>
+          </w:tcPr>
+          <w:p>
+            <w:pPr>
+              <w:pStyle w:val="TableContents"/>
+              <w:rPr/>
+            </w:pPr>
+            <w:r>
+              <w:rPr>
+                <w:b/>
+              </w:rPr>
+              <w:t>Pin 4</w:t>
+            </w:r>
+            <w:r>
+              <w:rPr/>
+              <w:t xml:space="preserve"> (RX)</w:t>
+            </w:r>
+          </w:p>
+        </w:tc>
+        <w:tc>
+          <w:tcPr>
+            <w:tcW w:w="1674" w:type="dxa"/>
+            <w:tcBorders/>
+            <w:vAlign w:val="center"/>
+          </w:tcPr>
+          <w:p>
+            <w:pPr>
+              <w:pStyle w:val="TableContents"/>
+              <w:ind w:hanging="0" w:start="0" w:end="0"/>
+              <w:rPr/>
+            </w:pPr>
+            <w:r>
+              <w:rPr/>
+              <w:t>Pi → Atari</w:t>
+            </w:r>
+          </w:p>
+        </w:tc>
+        <w:tc>
+          <w:tcPr>
+            <w:tcW w:w="2015" w:type="dxa"/>
+            <w:tcBorders/>
+            <w:vAlign w:val="center"/>
+          </w:tcPr>
+          <w:p>
+            <w:pPr>
+              <w:pStyle w:val="TableContents"/>
+              <w:ind w:hanging="0" w:start="0" w:end="0"/>
+              <w:rPr/>
+            </w:pPr>
+            <w:r>
+              <w:rPr/>
+              <w:t>R2OUT ← R2IN</w:t>
+            </w:r>
+          </w:p>
+        </w:tc>
+        <w:tc>
+          <w:tcPr>
+            <w:tcW w:w="2832" w:type="dxa"/>
+            <w:tcBorders/>
+            <w:vAlign w:val="center"/>
+          </w:tcPr>
+          <w:p>
+            <w:pPr>
+              <w:pStyle w:val="TableContents"/>
+              <w:rPr/>
+            </w:pPr>
+            <w:r>
+              <w:rPr>
+                <w:b/>
+              </w:rPr>
+              <w:t>GPIO 14</w:t>
+            </w:r>
+            <w:r>
+              <w:rPr/>
+              <w:t xml:space="preserve"> (TXD) - Pin 8</w:t>
+            </w:r>
+          </w:p>
+        </w:tc>
+      </w:tr>
+      <w:tr>
+        <w:trPr/>
+        <w:tc>
+          <w:tcPr>
+            <w:tcW w:w="1797" w:type="dxa"/>
+            <w:tcBorders/>
+            <w:vAlign w:val="center"/>
+          </w:tcPr>
+          <w:p>
+            <w:pPr>
+              <w:pStyle w:val="TableContents"/>
+              <w:rPr>
+                <w:b/>
+              </w:rPr>
+            </w:pPr>
+            <w:r>
+              <w:rPr>
+                <w:b/>
+              </w:rPr>
+              <w:t>Ground</w:t>
+            </w:r>
+          </w:p>
+        </w:tc>
+        <w:tc>
+          <w:tcPr>
+            <w:tcW w:w="1654" w:type="dxa"/>
+            <w:tcBorders/>
+            <w:vAlign w:val="center"/>
+          </w:tcPr>
+          <w:p>
+            <w:pPr>
+              <w:pStyle w:val="TableContents"/>
+              <w:rPr/>
+            </w:pPr>
+            <w:r>
+              <w:rPr>
+                <w:b/>
+              </w:rPr>
+              <w:t>Pin 5</w:t>
+            </w:r>
+            <w:r>
+              <w:rPr/>
+              <w:t xml:space="preserve"> (GND)</w:t>
+            </w:r>
+          </w:p>
+        </w:tc>
+        <w:tc>
+          <w:tcPr>
+            <w:tcW w:w="1674" w:type="dxa"/>
+            <w:tcBorders/>
+            <w:vAlign w:val="center"/>
+          </w:tcPr>
+          <w:p>
+            <w:pPr>
+              <w:pStyle w:val="TableContents"/>
+              <w:rPr/>
+            </w:pPr>
+            <w:r>
+              <w:rPr/>
+              <w:t>Common</w:t>
+            </w:r>
+          </w:p>
+        </w:tc>
+        <w:tc>
+          <w:tcPr>
+            <w:tcW w:w="2015" w:type="dxa"/>
+            <w:tcBorders/>
+            <w:vAlign w:val="center"/>
+          </w:tcPr>
+          <w:p>
+            <w:pPr>
+              <w:pStyle w:val="TableContents"/>
+              <w:rPr/>
+            </w:pPr>
+            <w:r>
+              <w:rPr/>
+              <w:t>GND</w:t>
+            </w:r>
+          </w:p>
+        </w:tc>
+        <w:tc>
+          <w:tcPr>
+            <w:tcW w:w="2832" w:type="dxa"/>
+            <w:tcBorders/>
+            <w:vAlign w:val="center"/>
+          </w:tcPr>
+          <w:p>
+            <w:pPr>
+              <w:pStyle w:val="TableContents"/>
+              <w:rPr/>
+            </w:pPr>
+            <w:r>
+              <w:rPr>
+                <w:b/>
+              </w:rPr>
+              <w:t>GND</w:t>
+            </w:r>
+            <w:r>
+              <w:rPr/>
+              <w:t xml:space="preserve"> - Pin 6</w:t>
+            </w:r>
+          </w:p>
+        </w:tc>
+      </w:tr>
+      <w:tr>
+        <w:trPr/>
+        <w:tc>
+          <w:tcPr>
+            <w:tcW w:w="1797" w:type="dxa"/>
+            <w:tcBorders/>
+            <w:vAlign w:val="center"/>
+          </w:tcPr>
+          <w:p>
+            <w:pPr>
+              <w:pStyle w:val="TableContents"/>
+              <w:rPr>
+                <w:b/>
+              </w:rPr>
+            </w:pPr>
+            <w:r>
+              <w:rPr>
+                <w:b/>
+              </w:rPr>
+              <w:t>Clear To Send</w:t>
+            </w:r>
+          </w:p>
+        </w:tc>
+        <w:tc>
+          <w:tcPr>
+            <w:tcW w:w="1654" w:type="dxa"/>
+            <w:tcBorders/>
+            <w:vAlign w:val="center"/>
+          </w:tcPr>
+          <w:p>
+            <w:pPr>
+              <w:pStyle w:val="TableContents"/>
+              <w:rPr/>
+            </w:pPr>
+            <w:r>
+              <w:rPr>
+                <w:b/>
+              </w:rPr>
+              <w:t>Pin 8</w:t>
+            </w:r>
+            <w:r>
+              <w:rPr/>
+              <w:t xml:space="preserve"> (CTS)</w:t>
+            </w:r>
+          </w:p>
+        </w:tc>
+        <w:tc>
+          <w:tcPr>
+            <w:tcW w:w="1674" w:type="dxa"/>
+            <w:tcBorders/>
+            <w:vAlign w:val="center"/>
+          </w:tcPr>
+          <w:p>
+            <w:pPr>
+              <w:pStyle w:val="TableContents"/>
+              <w:ind w:hanging="0" w:start="0" w:end="0"/>
+              <w:rPr/>
+            </w:pPr>
+            <w:r>
+              <w:rPr/>
+              <w:t>Pi → Atari</w:t>
+            </w:r>
+          </w:p>
+        </w:tc>
+        <w:tc>
+          <w:tcPr>
+            <w:tcW w:w="2015" w:type="dxa"/>
+            <w:tcBorders/>
+            <w:vAlign w:val="center"/>
+          </w:tcPr>
+          <w:p>
+            <w:pPr>
+              <w:pStyle w:val="TableContents"/>
+              <w:ind w:hanging="0" w:start="0" w:end="0"/>
+              <w:rPr/>
+            </w:pPr>
+            <w:r>
+              <w:rPr/>
+              <w:t>T1IN → T1OUT</w:t>
+            </w:r>
+          </w:p>
+        </w:tc>
+        <w:tc>
+          <w:tcPr>
+            <w:tcW w:w="2832" w:type="dxa"/>
+            <w:tcBorders/>
+            <w:vAlign w:val="center"/>
+          </w:tcPr>
+          <w:p>
+            <w:pPr>
+              <w:pStyle w:val="TableContents"/>
+              <w:rPr/>
+            </w:pPr>
+            <w:r>
+              <w:rPr>
+                <w:b/>
+              </w:rPr>
+              <w:t>GPIO 17</w:t>
+            </w:r>
+            <w:r>
+              <w:rPr/>
+              <w:t xml:space="preserve"> (RTS) - Pin 11</w:t>
+            </w:r>
+          </w:p>
+        </w:tc>
+      </w:tr>
+      <w:tr>
+        <w:trPr/>
+        <w:tc>
+          <w:tcPr>
+            <w:tcW w:w="1797" w:type="dxa"/>
+            <w:tcBorders/>
+            <w:vAlign w:val="center"/>
+          </w:tcPr>
+          <w:p>
+            <w:pPr>
+              <w:pStyle w:val="TableContents"/>
+              <w:rPr>
+                <w:b/>
+              </w:rPr>
+            </w:pPr>
+            <w:r>
+              <w:rPr>
+                <w:b/>
+              </w:rPr>
+              <w:t>Request To Send</w:t>
+            </w:r>
+          </w:p>
+        </w:tc>
+        <w:tc>
+          <w:tcPr>
+            <w:tcW w:w="1654" w:type="dxa"/>
+            <w:tcBorders/>
+            <w:vAlign w:val="center"/>
+          </w:tcPr>
+          <w:p>
+            <w:pPr>
+              <w:pStyle w:val="TableContents"/>
+              <w:rPr/>
+            </w:pPr>
+            <w:r>
+              <w:rPr>
+                <w:b/>
+              </w:rPr>
+              <w:t>Pin 7</w:t>
+            </w:r>
+            <w:r>
+              <w:rPr/>
+              <w:t xml:space="preserve"> (RTS)</w:t>
+            </w:r>
+          </w:p>
+        </w:tc>
+        <w:tc>
+          <w:tcPr>
+            <w:tcW w:w="1674" w:type="dxa"/>
+            <w:tcBorders/>
+            <w:vAlign w:val="center"/>
+          </w:tcPr>
+          <w:p>
+            <w:pPr>
+              <w:pStyle w:val="TableContents"/>
+              <w:ind w:hanging="0" w:start="0" w:end="0"/>
+              <w:rPr/>
+            </w:pPr>
+            <w:r>
+              <w:rPr/>
+              <w:t>Atari → Pi</w:t>
+            </w:r>
+          </w:p>
+        </w:tc>
+        <w:tc>
+          <w:tcPr>
+            <w:tcW w:w="2015" w:type="dxa"/>
+            <w:tcBorders/>
+            <w:vAlign w:val="center"/>
+          </w:tcPr>
+          <w:p>
+            <w:pPr>
+              <w:pStyle w:val="TableContents"/>
+              <w:ind w:hanging="0" w:start="0" w:end="0"/>
+              <w:rPr/>
+            </w:pPr>
+            <w:r>
+              <w:rPr/>
+              <w:t>R1OUT ← R1IN</w:t>
+            </w:r>
+          </w:p>
+        </w:tc>
+        <w:tc>
+          <w:tcPr>
+            <w:tcW w:w="2832" w:type="dxa"/>
+            <w:tcBorders/>
+            <w:vAlign w:val="center"/>
+          </w:tcPr>
+          <w:p>
+            <w:pPr>
+              <w:pStyle w:val="TableContents"/>
+              <w:rPr/>
+            </w:pPr>
+            <w:r>
+              <w:rPr>
+                <w:b/>
+              </w:rPr>
+              <w:t>GPIO 16</w:t>
+            </w:r>
+            <w:r>
+              <w:rPr/>
+              <w:t xml:space="preserve"> (CTS) - Pin 36</w:t>
+            </w:r>
+          </w:p>
+        </w:tc>
+      </w:tr>
+      <w:tr>
+        <w:trPr/>
+        <w:tc>
+          <w:tcPr>
+            <w:tcW w:w="1797" w:type="dxa"/>
+            <w:tcBorders/>
+            <w:vAlign w:val="center"/>
+          </w:tcPr>
+          <w:p>
+            <w:pPr>
+              <w:pStyle w:val="TableContents"/>
+              <w:rPr>
+                <w:b/>
+              </w:rPr>
+            </w:pPr>
+            <w:r>
+              <w:rPr>
+                <w:b/>
+              </w:rPr>
+              <w:t>Modem Ready</w:t>
+            </w:r>
+          </w:p>
+        </w:tc>
+        <w:tc>
+          <w:tcPr>
+            <w:tcW w:w="1654" w:type="dxa"/>
+            <w:tcBorders/>
+            <w:vAlign w:val="center"/>
+          </w:tcPr>
+          <w:p>
+            <w:pPr>
+              <w:pStyle w:val="TableContents"/>
+              <w:rPr/>
+            </w:pPr>
+            <w:r>
+              <w:rPr>
+                <w:b/>
+              </w:rPr>
+              <w:t>Pin 6</w:t>
+            </w:r>
+            <w:r>
+              <w:rPr/>
+              <w:t xml:space="preserve"> (DSR)</w:t>
+            </w:r>
+          </w:p>
+        </w:tc>
+        <w:tc>
+          <w:tcPr>
+            <w:tcW w:w="1674" w:type="dxa"/>
+            <w:tcBorders/>
+            <w:vAlign w:val="center"/>
+          </w:tcPr>
+          <w:p>
+            <w:pPr>
+              <w:pStyle w:val="TableContents"/>
+              <w:rPr>
+                <w:b/>
+              </w:rPr>
+            </w:pPr>
+            <w:r>
+              <w:rPr>
+                <w:b/>
+              </w:rPr>
+              <w:t>Loopback</w:t>
+            </w:r>
+          </w:p>
+        </w:tc>
+        <w:tc>
+          <w:tcPr>
+            <w:tcW w:w="2015" w:type="dxa"/>
+            <w:tcBorders/>
+            <w:vAlign w:val="center"/>
+          </w:tcPr>
+          <w:p>
+            <w:pPr>
+              <w:pStyle w:val="TableContents"/>
+              <w:rPr/>
+            </w:pPr>
+            <w:r>
+              <w:rPr/>
+              <w:t>--</w:t>
+            </w:r>
+          </w:p>
+        </w:tc>
+        <w:tc>
+          <w:tcPr>
+            <w:tcW w:w="2832" w:type="dxa"/>
+            <w:tcBorders/>
+            <w:vAlign w:val="center"/>
+          </w:tcPr>
+          <w:p>
+            <w:pPr>
+              <w:pStyle w:val="TableContents"/>
+              <w:rPr/>
+            </w:pPr>
+            <w:r>
+              <w:rPr/>
+              <w:t>--</w:t>
+            </w:r>
+          </w:p>
+        </w:tc>
+      </w:tr>
+      <w:tr>
+        <w:trPr/>
+        <w:tc>
+          <w:tcPr>
+            <w:tcW w:w="1797" w:type="dxa"/>
+            <w:tcBorders/>
+            <w:vAlign w:val="center"/>
+          </w:tcPr>
+          <w:p>
+            <w:pPr>
+              <w:pStyle w:val="TableContents"/>
+              <w:rPr>
+                <w:b/>
+              </w:rPr>
+            </w:pPr>
+            <w:r>
+              <w:rPr>
+                <w:b/>
+              </w:rPr>
+              <w:t>Carrier Detect</w:t>
+            </w:r>
+          </w:p>
+        </w:tc>
+        <w:tc>
+          <w:tcPr>
+            <w:tcW w:w="1654" w:type="dxa"/>
+            <w:tcBorders/>
+            <w:vAlign w:val="center"/>
+          </w:tcPr>
+          <w:p>
+            <w:pPr>
+              <w:pStyle w:val="TableContents"/>
+              <w:rPr/>
+            </w:pPr>
+            <w:r>
+              <w:rPr>
+                <w:b/>
+              </w:rPr>
+              <w:t>Pin 2</w:t>
+            </w:r>
+            <w:r>
+              <w:rPr/>
+              <w:t xml:space="preserve"> (CD)</w:t>
+            </w:r>
+          </w:p>
+        </w:tc>
+        <w:tc>
+          <w:tcPr>
+            <w:tcW w:w="1674" w:type="dxa"/>
+            <w:tcBorders/>
+            <w:vAlign w:val="center"/>
+          </w:tcPr>
+          <w:p>
+            <w:pPr>
+              <w:pStyle w:val="TableContents"/>
+              <w:rPr>
+                <w:b/>
+              </w:rPr>
+            </w:pPr>
+            <w:r>
+              <w:rPr>
+                <w:b/>
+              </w:rPr>
+              <w:t>Loopback</w:t>
+            </w:r>
+          </w:p>
+        </w:tc>
+        <w:tc>
+          <w:tcPr>
+            <w:tcW w:w="2015" w:type="dxa"/>
+            <w:tcBorders/>
+            <w:vAlign w:val="center"/>
+          </w:tcPr>
+          <w:p>
+            <w:pPr>
+              <w:pStyle w:val="TableContents"/>
+              <w:rPr/>
+            </w:pPr>
+            <w:r>
+              <w:rPr/>
+              <w:t>--</w:t>
+            </w:r>
+          </w:p>
+        </w:tc>
+        <w:tc>
+          <w:tcPr>
+            <w:tcW w:w="2832" w:type="dxa"/>
+            <w:tcBorders/>
+            <w:vAlign w:val="center"/>
+          </w:tcPr>
+          <w:p>
+            <w:pPr>
+              <w:pStyle w:val="TableContents"/>
+              <w:rPr/>
+            </w:pPr>
+            <w:r>
+              <w:rPr/>
+              <w:t>--</w:t>
+            </w:r>
+          </w:p>
+        </w:tc>
+      </w:tr>
+      <w:tr>
+        <w:trPr/>
+        <w:tc>
+          <w:tcPr>
+            <w:tcW w:w="1797" w:type="dxa"/>
+            <w:tcBorders/>
+            <w:vAlign w:val="center"/>
+          </w:tcPr>
+          <w:p>
+            <w:pPr>
+              <w:pStyle w:val="TableContents"/>
+              <w:rPr>
+                <w:b/>
+              </w:rPr>
+            </w:pPr>
+            <w:r>
+              <w:rPr>
+                <w:b/>
+              </w:rPr>
+              <w:t>Terminal Ready</w:t>
+            </w:r>
+          </w:p>
+        </w:tc>
+        <w:tc>
+          <w:tcPr>
+            <w:tcW w:w="1654" w:type="dxa"/>
+            <w:tcBorders/>
+            <w:vAlign w:val="center"/>
+          </w:tcPr>
+          <w:p>
+            <w:pPr>
+              <w:pStyle w:val="TableContents"/>
+              <w:rPr/>
+            </w:pPr>
+            <w:r>
+              <w:rPr>
+                <w:b/>
+              </w:rPr>
+              <w:t>Pin 1</w:t>
+            </w:r>
+            <w:r>
+              <w:rPr/>
+              <w:t xml:space="preserve"> (DTR)</w:t>
+            </w:r>
+          </w:p>
+        </w:tc>
+        <w:tc>
+          <w:tcPr>
+            <w:tcW w:w="1674" w:type="dxa"/>
+            <w:tcBorders/>
+            <w:vAlign w:val="center"/>
+          </w:tcPr>
+          <w:p>
+            <w:pPr>
+              <w:pStyle w:val="TableContents"/>
+              <w:rPr>
+                <w:b/>
+              </w:rPr>
+            </w:pPr>
+            <w:r>
+              <w:rPr>
+                <w:b/>
+              </w:rPr>
+              <w:t>Loopback</w:t>
+            </w:r>
+          </w:p>
+        </w:tc>
+        <w:tc>
+          <w:tcPr>
+            <w:tcW w:w="2015" w:type="dxa"/>
+            <w:tcBorders/>
+            <w:vAlign w:val="center"/>
+          </w:tcPr>
+          <w:p>
+            <w:pPr>
+              <w:pStyle w:val="TableContents"/>
+              <w:rPr/>
+            </w:pPr>
+            <w:r>
+              <w:rPr/>
+              <w:t>--</w:t>
+            </w:r>
+          </w:p>
+        </w:tc>
+        <w:tc>
+          <w:tcPr>
+            <w:tcW w:w="2832" w:type="dxa"/>
+            <w:tcBorders/>
+            <w:vAlign w:val="center"/>
+          </w:tcPr>
+          <w:p>
+            <w:pPr>
+              <w:pStyle w:val="TableContents"/>
+              <w:rPr/>
+            </w:pPr>
+            <w:r>
+              <w:rPr/>
+              <w:t>--</w:t>
+            </w:r>
+          </w:p>
+        </w:tc>
+      </w:tr>
+    </w:tbl>
+    <w:p>
+      <w:pPr>
+        <w:pStyle w:val="BodyText"/>
+        <w:rPr/>
+      </w:pPr>
+      <w:r>
+        <w:rPr/>
+        <w:t xml:space="preserve"> </w:t>
+      </w:r>
+    </w:p>
+    <w:p>
+      <w:pPr>
+        <w:pStyle w:val="BodyText"/>
+        <w:rPr>
+          <w:b/>
+        </w:rPr>
+      </w:pPr>
+      <w:r>
+        <w:rPr>
+          <w:b/>
+        </w:rPr>
+      </w:r>
+    </w:p>
+    <w:p>
+      <w:pPr>
+        <w:pStyle w:val="BodyText"/>
+        <w:rPr/>
+      </w:pPr>
+      <w:r>
+        <w:rPr>
+          <w:b/>
+        </w:rPr>
+        <w:t>The "Always Ready" Loopback:</w:t>
+      </w:r>
+      <w:r>
+        <w:rPr/>
+        <w:t xml:space="preserve"> Inside the DB9 connector plugging into the Atari 850, solder a small jumper wire connecting </w:t>
+      </w:r>
+      <w:r>
+        <w:rPr>
+          <w:b/>
+        </w:rPr>
+        <w:t>Pin 1 (DTR)</w:t>
+      </w:r>
+      <w:r>
+        <w:rPr/>
+        <w:t xml:space="preserve"> to both </w:t>
+      </w:r>
+      <w:r>
+        <w:rPr>
+          <w:b/>
+        </w:rPr>
+        <w:t>Pin 6 (DSR)</w:t>
+      </w:r>
+      <w:r>
+        <w:rPr/>
+        <w:t xml:space="preserve"> and </w:t>
+      </w:r>
+      <w:r>
+        <w:rPr>
+          <w:b/>
+        </w:rPr>
+        <w:t>Pin 2 (CD)</w:t>
+      </w:r>
+      <w:r>
+        <w:rPr/>
+        <w:t>. This ensures the Atari 850 instantly sees the "modem" (Pi) as online when the Atari is powered on.</w:t>
+      </w:r>
+    </w:p>
+    <w:p>
+      <w:pPr>
+        <w:pStyle w:val="Heading4"/>
+        <w:spacing w:before="0" w:after="283"/>
+        <w:rPr/>
+      </w:pPr>
+      <w:r>
+        <w:rPr/>
+      </w:r>
+    </w:p>
+    <w:p>
+      <w:pPr>
+        <w:pStyle w:val="Heading4"/>
+        <w:spacing w:before="0" w:after="283"/>
+        <w:rPr/>
+      </w:pPr>
+      <w:r>
+        <w:rPr/>
+        <w:t>8.4 Raspberry Pi OS Configuration</w:t>
+      </w:r>
+    </w:p>
+    <w:p>
+      <w:pPr>
+        <w:pStyle w:val="BodyText"/>
+        <w:rPr/>
+      </w:pPr>
+      <w:r>
+        <w:rPr/>
+        <w:t>Before running AspeQt, you must free the UART from the Linux console.</w:t>
+      </w:r>
+    </w:p>
+    <w:p>
+      <w:pPr>
+        <w:pStyle w:val="BodyText"/>
+        <w:numPr>
+          <w:ilvl w:val="0"/>
+          <w:numId w:val="10"/>
+        </w:numPr>
+        <w:tabs>
+          <w:tab w:val="clear" w:pos="709"/>
+          <w:tab w:val="left" w:pos="0" w:leader="none"/>
+        </w:tabs>
+        <w:ind w:hanging="283" w:start="709"/>
+        <w:rPr>
+          <w:b/>
+        </w:rPr>
+      </w:pPr>
+      <w:r>
+        <w:rPr>
+          <w:b/>
+        </w:rPr>
+        <w:t>Disable Serial Console:</w:t>
+      </w:r>
+    </w:p>
+    <w:p>
+      <w:pPr>
+        <w:pStyle w:val="BodyText"/>
+        <w:numPr>
+          <w:ilvl w:val="1"/>
+          <w:numId w:val="10"/>
+        </w:numPr>
+        <w:tabs>
+          <w:tab w:val="clear" w:pos="709"/>
+          <w:tab w:val="left" w:pos="0" w:leader="none"/>
+        </w:tabs>
+        <w:ind w:hanging="283" w:start="1418"/>
+        <w:rPr/>
+      </w:pPr>
+      <w:r>
+        <w:rPr/>
+        <w:t xml:space="preserve">Run </w:t>
+      </w:r>
+      <w:r>
+        <w:rPr>
+          <w:rStyle w:val="SourceText"/>
+        </w:rPr>
+        <w:t>sudo raspi-config</w:t>
+      </w:r>
+    </w:p>
+    <w:p>
+      <w:pPr>
+        <w:pStyle w:val="BodyText"/>
+        <w:numPr>
+          <w:ilvl w:val="1"/>
+          <w:numId w:val="10"/>
+        </w:numPr>
+        <w:tabs>
+          <w:tab w:val="clear" w:pos="709"/>
+          <w:tab w:val="left" w:pos="0" w:leader="none"/>
+        </w:tabs>
+        <w:ind w:hanging="283" w:start="1418" w:end="0"/>
+        <w:rPr/>
+      </w:pPr>
+      <w:r>
+        <w:rPr/>
+        <w:t xml:space="preserve">Navigate to </w:t>
+      </w:r>
+      <w:r>
+        <w:rPr>
+          <w:b/>
+        </w:rPr>
+        <w:t>Interface Options</w:t>
+      </w:r>
+      <w:r>
+        <w:rPr/>
+        <w:t xml:space="preserve"> → </w:t>
+      </w:r>
+      <w:r>
+        <w:rPr>
+          <w:b/>
+        </w:rPr>
+        <w:t>Serial Port</w:t>
+      </w:r>
+      <w:r>
+        <w:rPr/>
+        <w:t>.</w:t>
+      </w:r>
+    </w:p>
+    <w:p>
+      <w:pPr>
+        <w:pStyle w:val="BodyText"/>
+        <w:numPr>
+          <w:ilvl w:val="1"/>
+          <w:numId w:val="10"/>
+        </w:numPr>
+        <w:tabs>
+          <w:tab w:val="clear" w:pos="709"/>
+          <w:tab w:val="left" w:pos="0" w:leader="none"/>
+        </w:tabs>
+        <w:ind w:hanging="283" w:start="1418" w:end="0"/>
+        <w:rPr/>
+      </w:pPr>
+      <w:r>
+        <w:rPr/>
+        <w:t xml:space="preserve">"Would you like a login shell to be accessible over serial?" → </w:t>
+      </w:r>
+      <w:r>
+        <w:rPr>
+          <w:b/>
+        </w:rPr>
+        <w:t>No</w:t>
+      </w:r>
+      <w:r>
+        <w:rPr/>
+        <w:t>.</w:t>
+      </w:r>
+    </w:p>
+    <w:p>
+      <w:pPr>
+        <w:pStyle w:val="BodyText"/>
+        <w:numPr>
+          <w:ilvl w:val="1"/>
+          <w:numId w:val="10"/>
+        </w:numPr>
+        <w:tabs>
+          <w:tab w:val="clear" w:pos="709"/>
+          <w:tab w:val="left" w:pos="0" w:leader="none"/>
+        </w:tabs>
+        <w:ind w:hanging="283" w:start="1418" w:end="0"/>
+        <w:rPr/>
+      </w:pPr>
+      <w:r>
+        <w:rPr/>
+        <w:t xml:space="preserve">"Would you like the serial port hardware to be enabled?" → </w:t>
+      </w:r>
+      <w:r>
+        <w:rPr>
+          <w:b/>
+        </w:rPr>
+        <w:t>Yes</w:t>
+      </w:r>
+      <w:r>
+        <w:rPr/>
+        <w:t>.</w:t>
+      </w:r>
+    </w:p>
+    <w:p>
+      <w:pPr>
+        <w:pStyle w:val="BodyText"/>
+        <w:numPr>
+          <w:ilvl w:val="0"/>
+          <w:numId w:val="10"/>
+        </w:numPr>
+        <w:tabs>
+          <w:tab w:val="clear" w:pos="709"/>
+          <w:tab w:val="left" w:pos="0" w:leader="none"/>
+        </w:tabs>
+        <w:ind w:hanging="283" w:start="709"/>
+        <w:rPr>
+          <w:b/>
+        </w:rPr>
+      </w:pPr>
+      <w:r>
+        <w:rPr>
+          <w:b/>
+        </w:rPr>
+        <w:t>Optimize UART (Disable Bluetooth):</w:t>
+      </w:r>
+    </w:p>
+    <w:p>
+      <w:pPr>
+        <w:pStyle w:val="BodyText"/>
+        <w:numPr>
+          <w:ilvl w:val="1"/>
+          <w:numId w:val="10"/>
+        </w:numPr>
+        <w:tabs>
+          <w:tab w:val="clear" w:pos="709"/>
+          <w:tab w:val="left" w:pos="0" w:leader="none"/>
+        </w:tabs>
+        <w:ind w:hanging="283" w:start="1418"/>
+        <w:rPr/>
+      </w:pPr>
+      <w:r>
+        <w:rPr/>
+        <w:t>To ensure stable timing for the Atari 850, use the primary UART (</w:t>
+      </w:r>
+      <w:r>
+        <w:rPr>
+          <w:rStyle w:val="SourceText"/>
+        </w:rPr>
+        <w:t>PL011</w:t>
+      </w:r>
+      <w:r>
+        <w:rPr/>
+        <w:t>) by disabling Bluetooth.</w:t>
+      </w:r>
+    </w:p>
+    <w:p>
+      <w:pPr>
+        <w:pStyle w:val="BodyText"/>
+        <w:numPr>
+          <w:ilvl w:val="1"/>
+          <w:numId w:val="10"/>
+        </w:numPr>
+        <w:tabs>
+          <w:tab w:val="clear" w:pos="709"/>
+          <w:tab w:val="left" w:pos="0" w:leader="none"/>
+        </w:tabs>
+        <w:ind w:hanging="283" w:start="1418"/>
+        <w:rPr/>
+      </w:pPr>
+      <w:r>
+        <w:rPr/>
+        <w:t xml:space="preserve">Edit config: </w:t>
+      </w:r>
+      <w:r>
+        <w:rPr>
+          <w:rStyle w:val="SourceText"/>
+        </w:rPr>
+        <w:t>sudo nano /boot/config.txt</w:t>
+      </w:r>
+    </w:p>
+    <w:p>
+      <w:pPr>
+        <w:pStyle w:val="BodyText"/>
+        <w:numPr>
+          <w:ilvl w:val="1"/>
+          <w:numId w:val="10"/>
+        </w:numPr>
+        <w:tabs>
+          <w:tab w:val="clear" w:pos="709"/>
+          <w:tab w:val="left" w:pos="0" w:leader="none"/>
+        </w:tabs>
+        <w:ind w:hanging="283" w:start="1418"/>
+        <w:rPr/>
+      </w:pPr>
+      <w:r>
+        <w:rPr/>
+        <w:t xml:space="preserve">Add line: </w:t>
+      </w:r>
+      <w:r>
+        <w:rPr>
+          <w:rStyle w:val="SourceText"/>
+        </w:rPr>
+        <w:t>dtoverlay=disable-bt</w:t>
+      </w:r>
+    </w:p>
+    <w:p>
+      <w:pPr>
+        <w:pStyle w:val="BodyText"/>
+        <w:numPr>
+          <w:ilvl w:val="1"/>
+          <w:numId w:val="10"/>
+        </w:numPr>
+        <w:tabs>
+          <w:tab w:val="clear" w:pos="709"/>
+          <w:tab w:val="left" w:pos="0" w:leader="none"/>
+        </w:tabs>
+        <w:ind w:hanging="283" w:start="1418"/>
+        <w:rPr/>
+      </w:pPr>
+      <w:r>
+        <w:rPr/>
+        <w:t>Save and Reboot.</w:t>
+      </w:r>
+    </w:p>
+    <w:p>
+      <w:pPr>
+        <w:pStyle w:val="Heading4"/>
+        <w:spacing w:before="0" w:after="283"/>
+        <w:rPr/>
+      </w:pPr>
+      <w:r>
+        <w:rPr/>
+      </w:r>
+    </w:p>
+    <w:p>
+      <w:pPr>
+        <w:pStyle w:val="Heading4"/>
+        <w:spacing w:before="0" w:after="283"/>
+        <w:rPr/>
+      </w:pPr>
+      <w:r>
+        <w:rPr/>
+        <w:t>8.5 AspeQt Configuration (Pi Specifics)</w:t>
+      </w:r>
+    </w:p>
+    <w:p>
+      <w:pPr>
+        <w:pStyle w:val="BodyText"/>
+        <w:rPr/>
+      </w:pPr>
+      <w:r>
+        <w:rPr/>
+        <w:t xml:space="preserve">Change the settings in </w:t>
+      </w:r>
+      <w:r>
+        <w:rPr>
+          <w:b/>
+        </w:rPr>
+        <w:t>Tools &gt; Options &gt; Modem Bridge</w:t>
+      </w:r>
+      <w:r>
+        <w:rPr/>
+        <w:t xml:space="preserve"> to match the Linux environment:</w:t>
+      </w:r>
+    </w:p>
+    <w:tbl>
+      <w:tblPr>
+        <w:tblW w:w="9972" w:type="dxa"/>
+        <w:jc w:val="start"/>
+        <w:tblInd w:w="0" w:type="dxa"/>
+        <w:tblLayout w:type="fixed"/>
+        <w:tblCellMar>
+          <w:top w:w="28" w:type="dxa"/>
+          <w:start w:w="28" w:type="dxa"/>
+          <w:bottom w:w="28" w:type="dxa"/>
+          <w:end w:w="28" w:type="dxa"/>
+        </w:tblCellMar>
+      </w:tblPr>
+      <w:tblGrid>
+        <w:gridCol w:w="1391"/>
+        <w:gridCol w:w="8580"/>
+      </w:tblGrid>
+      <w:tr>
+        <w:trPr>
+          <w:tblHeader w:val="true"/>
+        </w:trPr>
+        <w:tc>
+          <w:tcPr>
+            <w:tcW w:w="1391" w:type="dxa"/>
+            <w:tcBorders/>
+            <w:vAlign w:val="center"/>
+          </w:tcPr>
+          <w:p>
+            <w:pPr>
+              <w:pStyle w:val="TableContents"/>
+              <w:rPr/>
+            </w:pPr>
+            <w:r>
+              <w:rPr/>
+              <w:t>Setting</w:t>
+            </w:r>
+          </w:p>
+        </w:tc>
+        <w:tc>
+          <w:tcPr>
+            <w:tcW w:w="8580" w:type="dxa"/>
+            <w:tcBorders/>
+            <w:vAlign w:val="center"/>
+          </w:tcPr>
+          <w:p>
+            <w:pPr>
+              <w:pStyle w:val="TableContents"/>
+              <w:rPr/>
+            </w:pPr>
+            <w:r>
+              <w:rPr/>
+              <w:t>Value for Raspberry Pi</w:t>
+            </w:r>
+          </w:p>
+        </w:tc>
+      </w:tr>
+      <w:tr>
+        <w:trPr/>
+        <w:tc>
+          <w:tcPr>
+            <w:tcW w:w="1391" w:type="dxa"/>
+            <w:tcBorders/>
+            <w:vAlign w:val="center"/>
+          </w:tcPr>
+          <w:p>
+            <w:pPr>
+              <w:pStyle w:val="TableContents"/>
+              <w:rPr>
+                <w:b/>
+              </w:rPr>
+            </w:pPr>
+            <w:r>
+              <w:rPr>
+                <w:b/>
+              </w:rPr>
+              <w:t>Serial Port</w:t>
+            </w:r>
+          </w:p>
+        </w:tc>
+        <w:tc>
+          <w:tcPr>
+            <w:tcW w:w="8580" w:type="dxa"/>
+            <w:tcBorders/>
+            <w:vAlign w:val="center"/>
+          </w:tcPr>
+          <w:p>
+            <w:pPr>
+              <w:pStyle w:val="TableContents"/>
+              <w:rPr/>
+            </w:pPr>
+            <w:r>
+              <w:rPr>
+                <w:rStyle w:val="SourceText"/>
+              </w:rPr>
+              <w:t>/dev/ttyAMA0</w:t>
+            </w:r>
+            <w:r>
+              <w:rPr/>
+              <w:t xml:space="preserve"> (if BT disabled) OR </w:t>
+            </w:r>
+            <w:r>
+              <w:rPr>
+                <w:rStyle w:val="SourceText"/>
+              </w:rPr>
+              <w:t>/dev/serial0</w:t>
+            </w:r>
+          </w:p>
+        </w:tc>
+      </w:tr>
+      <w:tr>
+        <w:trPr/>
+        <w:tc>
+          <w:tcPr>
+            <w:tcW w:w="1391" w:type="dxa"/>
+            <w:tcBorders/>
+            <w:vAlign w:val="center"/>
+          </w:tcPr>
+          <w:p>
+            <w:pPr>
+              <w:pStyle w:val="TableContents"/>
+              <w:rPr>
+                <w:b/>
+              </w:rPr>
+            </w:pPr>
+            <w:r>
+              <w:rPr>
+                <w:b/>
+              </w:rPr>
+              <w:t>Baud Rate</w:t>
+            </w:r>
+          </w:p>
+        </w:tc>
+        <w:tc>
+          <w:tcPr>
+            <w:tcW w:w="8580" w:type="dxa"/>
+            <w:tcBorders/>
+            <w:vAlign w:val="center"/>
+          </w:tcPr>
+          <w:p>
+            <w:pPr>
+              <w:pStyle w:val="TableContents"/>
+              <w:rPr/>
+            </w:pPr>
+            <w:r>
+              <w:rPr>
+                <w:b/>
+              </w:rPr>
+              <w:t>19200</w:t>
+            </w:r>
+            <w:r>
+              <w:rPr/>
+              <w:t xml:space="preserve"> (Recommended)</w:t>
+            </w:r>
+          </w:p>
+        </w:tc>
+      </w:tr>
+      <w:tr>
+        <w:trPr/>
+        <w:tc>
+          <w:tcPr>
+            <w:tcW w:w="1391" w:type="dxa"/>
+            <w:tcBorders/>
+            <w:vAlign w:val="center"/>
+          </w:tcPr>
+          <w:p>
+            <w:pPr>
+              <w:pStyle w:val="TableContents"/>
+              <w:rPr>
+                <w:b/>
+              </w:rPr>
+            </w:pPr>
+            <w:r>
+              <w:rPr>
+                <w:b/>
+              </w:rPr>
+              <w:t>Flow Control</w:t>
+            </w:r>
+          </w:p>
+        </w:tc>
+        <w:tc>
+          <w:tcPr>
+            <w:tcW w:w="8580" w:type="dxa"/>
+            <w:tcBorders/>
+            <w:vAlign w:val="center"/>
+          </w:tcPr>
+          <w:p>
+            <w:pPr>
+              <w:pStyle w:val="TableContents"/>
+              <w:rPr/>
+            </w:pPr>
+            <w:r>
+              <w:rPr>
+                <w:b/>
+              </w:rPr>
+              <w:t>OFF</w:t>
+            </w:r>
+            <w:r>
+              <w:rPr/>
+              <w:t xml:space="preserve"> (Recommended for initial setup). Only enable if the "Loopback" wiring above is 100% verified.</w:t>
+            </w:r>
+          </w:p>
+        </w:tc>
+      </w:tr>
+    </w:tbl>
+    <w:p>
+      <w:pPr>
+        <w:pStyle w:val="BodyText"/>
+        <w:spacing w:before="0" w:after="0"/>
+        <w:rPr/>
+      </w:pPr>
+      <w:r>
+        <w:rPr/>
+      </w:r>
+    </w:p>
+    <w:p>
+      <w:pPr>
+        <w:sectPr>
+          <w:type w:val="continuous"/>
+          <w:pgSz w:w="12240" w:h="15840"/>
+          <w:pgMar w:left="1134" w:right="1134" w:gutter="0" w:header="0" w:top="1134" w:footer="0" w:bottom="1134"/>
+          <w:formProt w:val="false"/>
+          <w:textDirection w:val="lrTb"/>
+          <w:docGrid w:type="default" w:linePitch="100" w:charSpace="0"/>
+        </w:sectPr>
+      </w:pPr>
+    </w:p>
+    <w:p>
+      <w:pPr>
+        <w:pStyle w:val="Normal"/>
+        <w:bidi w:val="0"/>
+        <w:jc w:val="start"/>
+        <w:rPr/>
+      </w:pPr>
+      <w:r>
+        <w:rPr/>
+      </w:r>
+    </w:p>
     <w:sectPr>
-      <w:type w:val="nextPage"/>
+      <w:type w:val="continuous"/>
       <w:pgSz w:w="12240" w:h="15840"/>
       <w:pgMar w:left="1134" w:right="1134" w:gutter="0" w:header="0" w:top="1134" w:footer="0" w:bottom="1134"/>
-      <w:pgNumType w:fmt="decimal"/>
       <w:formProt w:val="false"/>
       <w:textDirection w:val="lrTb"/>
       <w:docGrid w:type="default" w:linePitch="100" w:charSpace="0"/>
@@ -6803,6 +8738,415 @@
     </w:lvl>
   </w:abstractNum>
   <w:abstractNum w:abstractNumId="8">
+    <w:lvl w:ilvl="0">
+      <w:start w:val="1"/>
+      <w:numFmt w:val="bullet"/>
+      <w:lvlText w:val=""/>
+      <w:lvlJc w:val="start"/>
+      <w:pPr>
+        <w:tabs>
+          <w:tab w:val="num" w:pos="709"/>
+        </w:tabs>
+        <w:ind w:start="709" w:hanging="283"/>
+      </w:pPr>
+      <w:rPr>
+        <w:rFonts w:ascii="Symbol" w:hAnsi="Symbol" w:cs="Symbol" w:hint="default"/>
+      </w:rPr>
+    </w:lvl>
+    <w:lvl w:ilvl="1">
+      <w:start w:val="1"/>
+      <w:numFmt w:val="bullet"/>
+      <w:lvlText w:val=""/>
+      <w:lvlJc w:val="start"/>
+      <w:pPr>
+        <w:tabs>
+          <w:tab w:val="num" w:pos="1418"/>
+        </w:tabs>
+        <w:ind w:start="1418" w:hanging="283"/>
+      </w:pPr>
+      <w:rPr>
+        <w:rFonts w:ascii="Symbol" w:hAnsi="Symbol" w:cs="Symbol" w:hint="default"/>
+      </w:rPr>
+    </w:lvl>
+    <w:lvl w:ilvl="2">
+      <w:start w:val="1"/>
+      <w:numFmt w:val="bullet"/>
+      <w:lvlText w:val=""/>
+      <w:lvlJc w:val="start"/>
+      <w:pPr>
+        <w:tabs>
+          <w:tab w:val="num" w:pos="2127"/>
+        </w:tabs>
+        <w:ind w:start="2127" w:hanging="283"/>
+      </w:pPr>
+      <w:rPr>
+        <w:rFonts w:ascii="Symbol" w:hAnsi="Symbol" w:cs="Symbol" w:hint="default"/>
+      </w:rPr>
+    </w:lvl>
+    <w:lvl w:ilvl="3">
+      <w:start w:val="1"/>
+      <w:numFmt w:val="bullet"/>
+      <w:lvlText w:val=""/>
+      <w:lvlJc w:val="start"/>
+      <w:pPr>
+        <w:tabs>
+          <w:tab w:val="num" w:pos="2836"/>
+        </w:tabs>
+        <w:ind w:start="2836" w:hanging="283"/>
+      </w:pPr>
+      <w:rPr>
+        <w:rFonts w:ascii="Symbol" w:hAnsi="Symbol" w:cs="Symbol" w:hint="default"/>
+      </w:rPr>
+    </w:lvl>
+    <w:lvl w:ilvl="4">
+      <w:start w:val="1"/>
+      <w:numFmt w:val="bullet"/>
+      <w:lvlText w:val=""/>
+      <w:lvlJc w:val="start"/>
+      <w:pPr>
+        <w:tabs>
+          <w:tab w:val="num" w:pos="3545"/>
+        </w:tabs>
+        <w:ind w:start="3545" w:hanging="283"/>
+      </w:pPr>
+      <w:rPr>
+        <w:rFonts w:ascii="Symbol" w:hAnsi="Symbol" w:cs="Symbol" w:hint="default"/>
+      </w:rPr>
+    </w:lvl>
+    <w:lvl w:ilvl="5">
+      <w:start w:val="1"/>
+      <w:numFmt w:val="bullet"/>
+      <w:lvlText w:val=""/>
+      <w:lvlJc w:val="start"/>
+      <w:pPr>
+        <w:tabs>
+          <w:tab w:val="num" w:pos="4254"/>
+        </w:tabs>
+        <w:ind w:start="4254" w:hanging="283"/>
+      </w:pPr>
+      <w:rPr>
+        <w:rFonts w:ascii="Symbol" w:hAnsi="Symbol" w:cs="Symbol" w:hint="default"/>
+      </w:rPr>
+    </w:lvl>
+    <w:lvl w:ilvl="6">
+      <w:start w:val="1"/>
+      <w:numFmt w:val="bullet"/>
+      <w:lvlText w:val=""/>
+      <w:lvlJc w:val="start"/>
+      <w:pPr>
+        <w:tabs>
+          <w:tab w:val="num" w:pos="4963"/>
+        </w:tabs>
+        <w:ind w:start="4963" w:hanging="283"/>
+      </w:pPr>
+      <w:rPr>
+        <w:rFonts w:ascii="Symbol" w:hAnsi="Symbol" w:cs="Symbol" w:hint="default"/>
+      </w:rPr>
+    </w:lvl>
+    <w:lvl w:ilvl="7">
+      <w:start w:val="1"/>
+      <w:numFmt w:val="bullet"/>
+      <w:lvlText w:val=""/>
+      <w:lvlJc w:val="start"/>
+      <w:pPr>
+        <w:tabs>
+          <w:tab w:val="num" w:pos="5672"/>
+        </w:tabs>
+        <w:ind w:start="5672" w:hanging="283"/>
+      </w:pPr>
+      <w:rPr>
+        <w:rFonts w:ascii="Symbol" w:hAnsi="Symbol" w:cs="Symbol" w:hint="default"/>
+      </w:rPr>
+    </w:lvl>
+    <w:lvl w:ilvl="8">
+      <w:start w:val="1"/>
+      <w:numFmt w:val="bullet"/>
+      <w:lvlText w:val=""/>
+      <w:lvlJc w:val="start"/>
+      <w:pPr>
+        <w:tabs>
+          <w:tab w:val="num" w:pos="6381"/>
+        </w:tabs>
+        <w:ind w:start="6381" w:hanging="283"/>
+      </w:pPr>
+      <w:rPr>
+        <w:rFonts w:ascii="Symbol" w:hAnsi="Symbol" w:cs="Symbol" w:hint="default"/>
+      </w:rPr>
+    </w:lvl>
+  </w:abstractNum>
+  <w:abstractNum w:abstractNumId="9">
+    <w:lvl w:ilvl="0">
+      <w:start w:val="1"/>
+      <w:numFmt w:val="bullet"/>
+      <w:lvlText w:val=""/>
+      <w:lvlJc w:val="start"/>
+      <w:pPr>
+        <w:tabs>
+          <w:tab w:val="num" w:pos="709"/>
+        </w:tabs>
+        <w:ind w:start="709" w:hanging="283"/>
+      </w:pPr>
+      <w:rPr>
+        <w:rFonts w:ascii="Symbol" w:hAnsi="Symbol" w:cs="Symbol" w:hint="default"/>
+      </w:rPr>
+    </w:lvl>
+    <w:lvl w:ilvl="1">
+      <w:start w:val="1"/>
+      <w:numFmt w:val="bullet"/>
+      <w:lvlText w:val=""/>
+      <w:lvlJc w:val="start"/>
+      <w:pPr>
+        <w:tabs>
+          <w:tab w:val="num" w:pos="1418"/>
+        </w:tabs>
+        <w:ind w:start="1418" w:hanging="283"/>
+      </w:pPr>
+      <w:rPr>
+        <w:rFonts w:ascii="Symbol" w:hAnsi="Symbol" w:cs="Symbol" w:hint="default"/>
+      </w:rPr>
+    </w:lvl>
+    <w:lvl w:ilvl="2">
+      <w:start w:val="1"/>
+      <w:numFmt w:val="bullet"/>
+      <w:lvlText w:val=""/>
+      <w:lvlJc w:val="start"/>
+      <w:pPr>
+        <w:tabs>
+          <w:tab w:val="num" w:pos="2127"/>
+        </w:tabs>
+        <w:ind w:start="2127" w:hanging="283"/>
+      </w:pPr>
+      <w:rPr>
+        <w:rFonts w:ascii="Symbol" w:hAnsi="Symbol" w:cs="Symbol" w:hint="default"/>
+      </w:rPr>
+    </w:lvl>
+    <w:lvl w:ilvl="3">
+      <w:start w:val="1"/>
+      <w:numFmt w:val="bullet"/>
+      <w:lvlText w:val=""/>
+      <w:lvlJc w:val="start"/>
+      <w:pPr>
+        <w:tabs>
+          <w:tab w:val="num" w:pos="2836"/>
+        </w:tabs>
+        <w:ind w:start="2836" w:hanging="283"/>
+      </w:pPr>
+      <w:rPr>
+        <w:rFonts w:ascii="Symbol" w:hAnsi="Symbol" w:cs="Symbol" w:hint="default"/>
+      </w:rPr>
+    </w:lvl>
+    <w:lvl w:ilvl="4">
+      <w:start w:val="1"/>
+      <w:numFmt w:val="bullet"/>
+      <w:lvlText w:val=""/>
+      <w:lvlJc w:val="start"/>
+      <w:pPr>
+        <w:tabs>
+          <w:tab w:val="num" w:pos="3545"/>
+        </w:tabs>
+        <w:ind w:start="3545" w:hanging="283"/>
+      </w:pPr>
+      <w:rPr>
+        <w:rFonts w:ascii="Symbol" w:hAnsi="Symbol" w:cs="Symbol" w:hint="default"/>
+      </w:rPr>
+    </w:lvl>
+    <w:lvl w:ilvl="5">
+      <w:start w:val="1"/>
+      <w:numFmt w:val="bullet"/>
+      <w:lvlText w:val=""/>
+      <w:lvlJc w:val="start"/>
+      <w:pPr>
+        <w:tabs>
+          <w:tab w:val="num" w:pos="4254"/>
+        </w:tabs>
+        <w:ind w:start="4254" w:hanging="283"/>
+      </w:pPr>
+      <w:rPr>
+        <w:rFonts w:ascii="Symbol" w:hAnsi="Symbol" w:cs="Symbol" w:hint="default"/>
+      </w:rPr>
+    </w:lvl>
+    <w:lvl w:ilvl="6">
+      <w:start w:val="1"/>
+      <w:numFmt w:val="bullet"/>
+      <w:lvlText w:val=""/>
+      <w:lvlJc w:val="start"/>
+      <w:pPr>
+        <w:tabs>
+          <w:tab w:val="num" w:pos="4963"/>
+        </w:tabs>
+        <w:ind w:start="4963" w:hanging="283"/>
+      </w:pPr>
+      <w:rPr>
+        <w:rFonts w:ascii="Symbol" w:hAnsi="Symbol" w:cs="Symbol" w:hint="default"/>
+      </w:rPr>
+    </w:lvl>
+    <w:lvl w:ilvl="7">
+      <w:start w:val="1"/>
+      <w:numFmt w:val="bullet"/>
+      <w:lvlText w:val=""/>
+      <w:lvlJc w:val="start"/>
+      <w:pPr>
+        <w:tabs>
+          <w:tab w:val="num" w:pos="5672"/>
+        </w:tabs>
+        <w:ind w:start="5672" w:hanging="283"/>
+      </w:pPr>
+      <w:rPr>
+        <w:rFonts w:ascii="Symbol" w:hAnsi="Symbol" w:cs="Symbol" w:hint="default"/>
+      </w:rPr>
+    </w:lvl>
+    <w:lvl w:ilvl="8">
+      <w:start w:val="1"/>
+      <w:numFmt w:val="bullet"/>
+      <w:lvlText w:val=""/>
+      <w:lvlJc w:val="start"/>
+      <w:pPr>
+        <w:tabs>
+          <w:tab w:val="num" w:pos="6381"/>
+        </w:tabs>
+        <w:ind w:start="6381" w:hanging="283"/>
+      </w:pPr>
+      <w:rPr>
+        <w:rFonts w:ascii="Symbol" w:hAnsi="Symbol" w:cs="Symbol" w:hint="default"/>
+      </w:rPr>
+    </w:lvl>
+  </w:abstractNum>
+  <w:abstractNum w:abstractNumId="10">
+    <w:lvl w:ilvl="0">
+      <w:start w:val="1"/>
+      <w:numFmt w:val="decimal"/>
+      <w:lvlText w:val="%1."/>
+      <w:lvlJc w:val="start"/>
+      <w:pPr>
+        <w:tabs>
+          <w:tab w:val="num" w:pos="709"/>
+        </w:tabs>
+        <w:ind w:start="709" w:hanging="283"/>
+      </w:pPr>
+      <w:rPr/>
+    </w:lvl>
+    <w:lvl w:ilvl="1">
+      <w:start w:val="1"/>
+      <w:numFmt w:val="bullet"/>
+      <w:lvlText w:val=""/>
+      <w:lvlJc w:val="start"/>
+      <w:pPr>
+        <w:tabs>
+          <w:tab w:val="num" w:pos="1418"/>
+        </w:tabs>
+        <w:ind w:start="1418" w:hanging="283"/>
+      </w:pPr>
+      <w:rPr>
+        <w:rFonts w:ascii="Symbol" w:hAnsi="Symbol" w:cs="Symbol" w:hint="default"/>
+      </w:rPr>
+    </w:lvl>
+    <w:lvl w:ilvl="2">
+      <w:start w:val="1"/>
+      <w:numFmt w:val="bullet"/>
+      <w:lvlText w:val=""/>
+      <w:lvlJc w:val="start"/>
+      <w:pPr>
+        <w:tabs>
+          <w:tab w:val="num" w:pos="2127"/>
+        </w:tabs>
+        <w:ind w:start="2127" w:hanging="283"/>
+      </w:pPr>
+      <w:rPr>
+        <w:rFonts w:ascii="Symbol" w:hAnsi="Symbol" w:cs="Symbol" w:hint="default"/>
+      </w:rPr>
+    </w:lvl>
+    <w:lvl w:ilvl="3">
+      <w:start w:val="1"/>
+      <w:numFmt w:val="bullet"/>
+      <w:lvlText w:val=""/>
+      <w:lvlJc w:val="start"/>
+      <w:pPr>
+        <w:tabs>
+          <w:tab w:val="num" w:pos="2836"/>
+        </w:tabs>
+        <w:ind w:start="2836" w:hanging="283"/>
+      </w:pPr>
+      <w:rPr>
+        <w:rFonts w:ascii="Symbol" w:hAnsi="Symbol" w:cs="Symbol" w:hint="default"/>
+      </w:rPr>
+    </w:lvl>
+    <w:lvl w:ilvl="4">
+      <w:start w:val="1"/>
+      <w:numFmt w:val="bullet"/>
+      <w:lvlText w:val=""/>
+      <w:lvlJc w:val="start"/>
+      <w:pPr>
+        <w:tabs>
+          <w:tab w:val="num" w:pos="3545"/>
+        </w:tabs>
+        <w:ind w:start="3545" w:hanging="283"/>
+      </w:pPr>
+      <w:rPr>
+        <w:rFonts w:ascii="Symbol" w:hAnsi="Symbol" w:cs="Symbol" w:hint="default"/>
+      </w:rPr>
+    </w:lvl>
+    <w:lvl w:ilvl="5">
+      <w:start w:val="1"/>
+      <w:numFmt w:val="bullet"/>
+      <w:lvlText w:val=""/>
+      <w:lvlJc w:val="start"/>
+      <w:pPr>
+        <w:tabs>
+          <w:tab w:val="num" w:pos="4254"/>
+        </w:tabs>
+        <w:ind w:start="4254" w:hanging="283"/>
+      </w:pPr>
+      <w:rPr>
+        <w:rFonts w:ascii="Symbol" w:hAnsi="Symbol" w:cs="Symbol" w:hint="default"/>
+      </w:rPr>
+    </w:lvl>
+    <w:lvl w:ilvl="6">
+      <w:start w:val="1"/>
+      <w:numFmt w:val="bullet"/>
+      <w:lvlText w:val=""/>
+      <w:lvlJc w:val="start"/>
+      <w:pPr>
+        <w:tabs>
+          <w:tab w:val="num" w:pos="4963"/>
+        </w:tabs>
+        <w:ind w:start="4963" w:hanging="283"/>
+      </w:pPr>
+      <w:rPr>
+        <w:rFonts w:ascii="Symbol" w:hAnsi="Symbol" w:cs="Symbol" w:hint="default"/>
+      </w:rPr>
+    </w:lvl>
+    <w:lvl w:ilvl="7">
+      <w:start w:val="1"/>
+      <w:numFmt w:val="bullet"/>
+      <w:lvlText w:val=""/>
+      <w:lvlJc w:val="start"/>
+      <w:pPr>
+        <w:tabs>
+          <w:tab w:val="num" w:pos="5672"/>
+        </w:tabs>
+        <w:ind w:start="5672" w:hanging="283"/>
+      </w:pPr>
+      <w:rPr>
+        <w:rFonts w:ascii="Symbol" w:hAnsi="Symbol" w:cs="Symbol" w:hint="default"/>
+      </w:rPr>
+    </w:lvl>
+    <w:lvl w:ilvl="8">
+      <w:start w:val="1"/>
+      <w:numFmt w:val="bullet"/>
+      <w:lvlText w:val=""/>
+      <w:lvlJc w:val="start"/>
+      <w:pPr>
+        <w:tabs>
+          <w:tab w:val="num" w:pos="6381"/>
+        </w:tabs>
+        <w:ind w:start="6381" w:hanging="283"/>
+      </w:pPr>
+      <w:rPr>
+        <w:rFonts w:ascii="Symbol" w:hAnsi="Symbol" w:cs="Symbol" w:hint="default"/>
+      </w:rPr>
+    </w:lvl>
+  </w:abstractNum>
+  <w:abstractNum w:abstractNumId="11">
     <w:lvl w:ilvl="0">
       <w:start w:val="1"/>
       <w:numFmt w:val="none"/>
@@ -6944,6 +9288,15 @@
   </w:num>
   <w:num w:numId="8">
     <w:abstractNumId w:val="8"/>
+  </w:num>
+  <w:num w:numId="9">
+    <w:abstractNumId w:val="9"/>
+  </w:num>
+  <w:num w:numId="10">
+    <w:abstractNumId w:val="10"/>
+  </w:num>
+  <w:num w:numId="11">
+    <w:abstractNumId w:val="11"/>
   </w:num>
 </w:numbering>
 </file>
@@ -7036,6 +9389,23 @@
       <w:szCs w:val="28"/>
     </w:rPr>
   </w:style>
+  <w:style w:type="paragraph" w:styleId="Heading4">
+    <w:name w:val="heading 4"/>
+    <w:basedOn w:val="Heading"/>
+    <w:next w:val="BodyText"/>
+    <w:qFormat/>
+    <w:pPr>
+      <w:spacing w:before="120" w:after="120"/>
+      <w:outlineLvl w:val="3"/>
+    </w:pPr>
+    <w:rPr>
+      <w:rFonts w:ascii="Liberation Serif" w:hAnsi="Liberation Serif" w:eastAsia="Noto Serif CJK SC" w:cs="Lohit Devanagari"/>
+      <w:b/>
+      <w:bCs/>
+      <w:sz w:val="24"/>
+      <w:szCs w:val="24"/>
+    </w:rPr>
+  </w:style>
   <w:style w:type="character" w:styleId="Hyperlink">
     <w:name w:val="Hyperlink"/>
     <w:rPr>
@@ -7068,6 +9438,13 @@
     <w:rPr>
       <w:b/>
       <w:bCs/>
+    </w:rPr>
+  </w:style>
+  <w:style w:type="character" w:styleId="Bulletsuser">
+    <w:name w:val="Bullets (user)"/>
+    <w:qFormat/>
+    <w:rPr>
+      <w:rFonts w:ascii="OpenSymbol" w:hAnsi="OpenSymbol" w:eastAsia="OpenSymbol" w:cs="OpenSymbol"/>
     </w:rPr>
   </w:style>
   <w:style w:type="paragraph" w:styleId="Heading">

</xml_diff>